<commit_message>
Expand template Word report
</commit_message>
<xml_diff>
--- a/output/docx/2026AI微专业综合设计报告_说话人分离系统.docx
+++ b/output/docx/2026AI微专业综合设计报告_说话人分离系统.docx
@@ -1519,6 +1519,134 @@
     </w:p>
     <w:p>
       <w:pPr>
+        <w:spacing w:line="360" w:lineRule="exact" w:before="0" w:after="0"/>
+        <w:ind w:firstLine="0"/>
+        <w:jc w:val="center"/>
+      </w:pPr>
+      <w:r>
+        <w:rPr>
+          <w:rFonts w:ascii="Times New Roman" w:hAnsi="Times New Roman" w:eastAsia="宋体"/>
+          <w:b/>
+          <w:i w:val="0"/>
+          <w:sz w:val="21"/>
+        </w:rPr>
+        <w:t>摘  要</w:t>
+      </w:r>
+    </w:p>
+    <w:p>
+      <w:pPr>
+        <w:spacing w:line="360" w:lineRule="exact" w:before="0" w:after="0"/>
+        <w:ind w:firstLine="420"/>
+        <w:jc w:val="both"/>
+      </w:pPr>
+      <w:r>
+        <w:rPr>
+          <w:rFonts w:ascii="Times New Roman" w:hAnsi="Times New Roman" w:eastAsia="宋体"/>
+          <w:b w:val="0"/>
+          <w:i w:val="0"/>
+          <w:sz w:val="21"/>
+        </w:rPr>
+        <w:t>会议语音中的说话人分离任务旨在识别“谁在什么时候说话”，是会议转写、纪要生成、说话人角色归因和多人语音理解系统中的关键前处理环节。真实会议语音通常包含多人快速轮换、短暂停顿、远场噪声、混响、重叠发言和局部边界偏移等现象，单一模型直接输出的 diarization timeline 往往难以在速度、精度和稳定性之间取得一致最优。针对这一问题，本课题基于 AliMeeting 会议语音数据集，构建了一个默认离线运行、可复现、可审计的说话人分离增强系统。系统以 Sortformer 快速基线和 DiariZen 高质量慢速基线为基础，不重新训练单一模型，而是在 cached outputs 之上引入 slow-first selector、安全 fast fallback、稀疏 rule-recover overlay 和 guard/quarantine gate，对局部高置信修正进行受控写回。</w:t>
+      </w:r>
+    </w:p>
+    <w:p>
+      <w:pPr>
+        <w:spacing w:line="360" w:lineRule="exact" w:before="0" w:after="0"/>
+        <w:ind w:firstLine="420"/>
+        <w:jc w:val="both"/>
+      </w:pPr>
+      <w:r>
+        <w:rPr>
+          <w:rFonts w:ascii="Times New Roman" w:hAnsi="Times New Roman" w:eastAsia="宋体"/>
+          <w:b w:val="0"/>
+          <w:i w:val="0"/>
+          <w:sz w:val="21"/>
+        </w:rPr>
+        <w:t>最终交付系统使用 frozen cached outputs 与 frozen artifacts 进行离线 replay，运行时不调用 DeepSeek、Qwen、Omni 或 GPT 等在线 API，默认 live API calls 为 0。在 AliMeeting Eval development-pool 的 8 条录音、120 个 30 秒窗口上，系统最终 DER 为 16.4923%，优于 Sortformer fast baseline 的 28.5637% 和 DiariZen slow baseline 的 16.8809%，相对当前 best tracked baseline 提升 0.3886 个百分点，并优于当前跟踪的 5 个同窗口 baseline。完整 regression 通过 29/29 步，自检结果为 40 pass / 4 warn / 0 fail。实验结果表明，在强基线已经较优的情况下，基于离线证据、风险门控和可回退策略的增强框架仍然能够带来可复现的性能收益。</w:t>
+      </w:r>
+    </w:p>
+    <w:p>
+      <w:pPr>
+        <w:spacing w:line="360" w:lineRule="exact" w:before="0" w:after="0"/>
+        <w:ind w:firstLine="0"/>
+        <w:jc w:val="both"/>
+      </w:pPr>
+      <w:r>
+        <w:rPr>
+          <w:rFonts w:ascii="Times New Roman" w:hAnsi="Times New Roman" w:eastAsia="宋体"/>
+          <w:b w:val="0"/>
+          <w:i w:val="0"/>
+          <w:sz w:val="21"/>
+        </w:rPr>
+        <w:t>关键词：说话人分离；AliMeeting；双基线融合；离线增强；DER；可复现评测</w:t>
+      </w:r>
+    </w:p>
+    <w:p>
+      <w:pPr>
+        <w:spacing w:line="360" w:lineRule="exact" w:before="0" w:after="0"/>
+        <w:ind w:firstLine="0"/>
+        <w:jc w:val="center"/>
+      </w:pPr>
+      <w:r>
+        <w:rPr>
+          <w:rFonts w:ascii="Times New Roman" w:hAnsi="Times New Roman" w:eastAsia="宋体"/>
+          <w:b/>
+          <w:i w:val="0"/>
+          <w:sz w:val="21"/>
+        </w:rPr>
+        <w:t>Abstract</w:t>
+      </w:r>
+    </w:p>
+    <w:p>
+      <w:pPr>
+        <w:spacing w:line="360" w:lineRule="exact" w:before="0" w:after="0"/>
+        <w:ind w:firstLine="420"/>
+        <w:jc w:val="both"/>
+      </w:pPr>
+      <w:r>
+        <w:rPr>
+          <w:rFonts w:ascii="Times New Roman" w:hAnsi="Times New Roman" w:eastAsia="宋体"/>
+          <w:b w:val="0"/>
+          <w:i w:val="0"/>
+          <w:sz w:val="21"/>
+        </w:rPr>
+        <w:t>Speaker diarization aims to determine “who spoke when” in a multi-speaker audio stream and serves as a key front-end module for meeting transcription, meeting summarization, speaker attribution, and multi-speaker speech understanding. Real meeting recordings usually contain rapid speaker turns, short utterances, far-field noise, reverberation, overlapped speech, and local boundary shifts. As a result, a single diarization model may not consistently achieve the best trade-off among speed, accuracy, and robustness. To address this issue, this project develops an offline, reproducible, and auditable speaker diarization enhancement system on the AliMeeting corpus. Instead of training a new standalone model, the system builds upon cached outputs from a fast Sortformer baseline and a stronger but slower DiariZen baseline. It further introduces a slow-first selector, a safe fast fallback mechanism, a sparse rule-recover overlay, and a guard/quarantine gate to control local high-confidence modifications.</w:t>
+      </w:r>
+    </w:p>
+    <w:p>
+      <w:pPr>
+        <w:spacing w:line="360" w:lineRule="exact" w:before="0" w:after="0"/>
+        <w:ind w:firstLine="420"/>
+        <w:jc w:val="both"/>
+      </w:pPr>
+      <w:r>
+        <w:rPr>
+          <w:rFonts w:ascii="Times New Roman" w:hAnsi="Times New Roman" w:eastAsia="宋体"/>
+          <w:b w:val="0"/>
+          <w:i w:val="0"/>
+          <w:sz w:val="21"/>
+        </w:rPr>
+        <w:t>The final delivered system performs offline replay with frozen cached outputs and frozen artifacts. It does not invoke online APIs such as DeepSeek, Qwen, Omni, or GPT during the default execution path, resulting in zero live API calls. On the AliMeeting Eval development pool with 8 recordings and 120 windows of 30 seconds each, the final system achieves a DER of 16.4923%, outperforming the Sortformer fast baseline of 28.5637% and the DiariZen slow baseline of 16.8809%. It improves upon the best tracked baseline by 0.3886 percentage points and beats all 5 tracked same-window baselines. The full regression passes 29 out of 29 steps, and the self-check reports 40 passes, 4 warnings, and 0 failures. These results indicate that a controlled offline enhancement framework with evidence-based selection, fallback, and guard mechanisms can still provide reproducible gains over strong diarization baselines.</w:t>
+      </w:r>
+    </w:p>
+    <w:p>
+      <w:pPr>
+        <w:spacing w:line="360" w:lineRule="exact" w:before="0" w:after="0"/>
+        <w:ind w:firstLine="0"/>
+        <w:jc w:val="both"/>
+      </w:pPr>
+      <w:r>
+        <w:rPr>
+          <w:rFonts w:ascii="Times New Roman" w:hAnsi="Times New Roman" w:eastAsia="宋体"/>
+          <w:b w:val="0"/>
+          <w:i w:val="0"/>
+          <w:sz w:val="21"/>
+        </w:rPr>
+        <w:t>Keywords: speaker diarization; AliMeeting; dual-baseline fusion; offline enhancement; DER; reproducible evaluation</w:t>
+      </w:r>
+    </w:p>
+    <w:p>
+      <w:pPr>
         <w:pStyle w:val="2"/>
         <w:spacing w:line="360" w:lineRule="exact" w:before="180" w:after="180"/>
         <w:ind w:firstLine="0"/>
@@ -1547,23 +1675,55 @@
           <w:i w:val="0"/>
           <w:sz w:val="21"/>
         </w:rPr>
-        <w:t>会议语音理解系统需要解决多人轮流发言、短暂停顿、重叠语音、远场噪声和说话人身份变化等问题。说话人分离任务的目标是回答“谁在什么时候说话”，其输出结果会直接影响自动语音识别、会议纪要生成、行动项抽取和说话人角色归因等后续环节。若分离结果存在较多漏检、误检或说话人混淆，后续文本内容即使识别准确，也难以保持可靠的发言归属。</w:t>
-      </w:r>
-    </w:p>
-    <w:p>
-      <w:pPr>
-        <w:spacing w:line="360" w:lineRule="exact" w:before="0" w:after="0"/>
-        <w:ind w:firstLine="420"/>
-        <w:jc w:val="both"/>
-      </w:pPr>
-      <w:r>
-        <w:rPr>
-          <w:rFonts w:ascii="Times New Roman" w:hAnsi="Times New Roman" w:eastAsia="宋体"/>
-          <w:b w:val="0"/>
-          <w:i w:val="0"/>
-          <w:sz w:val="21"/>
-        </w:rPr>
-        <w:t>本课题面向 AliMeeting 会议语音数据集，构建一个默认离线运行、可复现、可审计的说话人分离增强系统。课题意义不只在于得到一个更低的 DER 数值，更在于形成一套可以交付、复核和持续扩展的实验框架：包括模型基线管理、离线增强策略、风险门控、完整 regression、自检报告和最终可运行命令。</w:t>
+        <w:t>随着在线会议、远程协作和智能办公系统的普及，会议语音数据正在成为组织知识沉淀的重要来源。会议语音理解系统不仅需要将音频转写为文本，还需要保留发言人的身份边界、说话顺序和上下文关系。说话人分离任务正是这一流程中的基础环节，其目标是在连续音频中标出每个说话人发言的起止时间，从而回答“谁在什么时候说话”。</w:t>
+      </w:r>
+    </w:p>
+    <w:p>
+      <w:pPr>
+        <w:spacing w:line="360" w:lineRule="exact" w:before="0" w:after="0"/>
+        <w:ind w:firstLine="420"/>
+        <w:jc w:val="both"/>
+      </w:pPr>
+      <w:r>
+        <w:rPr>
+          <w:rFonts w:ascii="Times New Roman" w:hAnsi="Times New Roman" w:eastAsia="宋体"/>
+          <w:b w:val="0"/>
+          <w:i w:val="0"/>
+          <w:sz w:val="21"/>
+        </w:rPr>
+        <w:t>如果说话人分离结果不可靠，后续模块会出现连锁误差。例如，自动语音识别虽然能够识别出文本内容，但若发言人标签错误，会议纪要中的观点归属、任务分配和责任追踪就会受到影响；若短片段或重叠语音被漏检，系统生成的会议摘要也可能遗漏关键意见。因此，说话人分离不仅是一个独立语音任务，也直接影响多模态会议智能系统的可用性。</w:t>
+      </w:r>
+    </w:p>
+    <w:p>
+      <w:pPr>
+        <w:spacing w:line="360" w:lineRule="exact" w:before="0" w:after="0"/>
+        <w:ind w:firstLine="420"/>
+        <w:jc w:val="both"/>
+      </w:pPr>
+      <w:r>
+        <w:rPr>
+          <w:rFonts w:ascii="Times New Roman" w:hAnsi="Times New Roman" w:eastAsia="宋体"/>
+          <w:b w:val="0"/>
+          <w:i w:val="0"/>
+          <w:sz w:val="21"/>
+        </w:rPr>
+        <w:t>从工程交付角度看，课程项目不能只停留在一次实验结果上，还需要提供可复现、可审计、可运行的完整框架。本课题围绕 AliMeeting 会议语音数据集，将模型基线、离线增强、风险控制、指标计算、回归测试和交付文档统一整理为一个 Python package，使老师或评审能够通过 quick start 和 regression 命令独立复核系统结果。</w:t>
+      </w:r>
+    </w:p>
+    <w:p>
+      <w:pPr>
+        <w:spacing w:line="360" w:lineRule="exact" w:before="0" w:after="0"/>
+        <w:ind w:firstLine="420"/>
+        <w:jc w:val="both"/>
+      </w:pPr>
+      <w:r>
+        <w:rPr>
+          <w:rFonts w:ascii="Times New Roman" w:hAnsi="Times New Roman" w:eastAsia="宋体"/>
+          <w:b w:val="0"/>
+          <w:i w:val="0"/>
+          <w:sz w:val="21"/>
+        </w:rPr>
+        <w:t>本课题的意义主要体现在三个方面。第一，在任务层面，围绕真实会议语音场景研究说话人分离问题，具有明确应用价值。第二，在方法层面，探索强基线之上的离线增强策略，而不是简单依赖单一模型输出。第三，在交付层面，将实验过程沉淀为结构化代码包和可复现文档，使研究结果具备更强的可信度和可维护性。</w:t>
       </w:r>
     </w:p>
     <w:p>
@@ -1613,23 +1773,39 @@
           <w:i w:val="0"/>
           <w:sz w:val="21"/>
         </w:rPr>
-        <w:t>说话人分离是语音处理中的经典任务，通常将连续音频切分为多个带有说话人标签的时间片段。传统系统多依赖声学特征、说话人嵌入和聚类方法；近年来，端到端神经说话人分离、重叠语音建模和自监督语音表示显著推动了该方向的发展。</w:t>
-      </w:r>
-    </w:p>
-    <w:p>
-      <w:pPr>
-        <w:spacing w:line="360" w:lineRule="exact" w:before="0" w:after="0"/>
-        <w:ind w:firstLine="420"/>
-        <w:jc w:val="both"/>
-      </w:pPr>
-      <w:r>
-        <w:rPr>
-          <w:rFonts w:ascii="Times New Roman" w:hAnsi="Times New Roman" w:eastAsia="宋体"/>
-          <w:b w:val="0"/>
-          <w:i w:val="0"/>
-          <w:sz w:val="21"/>
-        </w:rPr>
-        <w:t>会议场景比普通双人对话更复杂。会议中常出现多人快速切换、重叠发言、远场混响和不同录音设备造成的信号差异。因此，单一模型直接输出的 timeline 往往无法稳定覆盖所有局部情况，不同模型之间也会表现出速度、精度和稳定性上的差异。</w:t>
+        <w:t>说话人分离是语音处理中的经典任务，通常将连续音频划分为若干带有说话人标签的时间片段。早期系统往往采用语音活动检测、说话人嵌入提取和聚类的流水线结构；近年来，端到端神经说话人分离、自监督语音表示和重叠语音建模快速发展，使系统能够更好地处理多人发言和复杂声学环境。</w:t>
+      </w:r>
+    </w:p>
+    <w:p>
+      <w:pPr>
+        <w:spacing w:line="360" w:lineRule="exact" w:before="0" w:after="0"/>
+        <w:ind w:firstLine="420"/>
+        <w:jc w:val="both"/>
+      </w:pPr>
+      <w:r>
+        <w:rPr>
+          <w:rFonts w:ascii="Times New Roman" w:hAnsi="Times New Roman" w:eastAsia="宋体"/>
+          <w:b w:val="0"/>
+          <w:i w:val="0"/>
+          <w:sz w:val="21"/>
+        </w:rPr>
+        <w:t>会议场景与普通单人或双人语音不同。会议中常见多人快速切换、短时插话、远场拾音、设备差异和语音重叠等现象。尤其在多人会议中，说话人之间的转换边界可能非常接近，某些短片段只有几百毫秒到数秒，模型如果只依据局部声学特征，容易出现边界偏移或说话人混淆。</w:t>
+      </w:r>
+    </w:p>
+    <w:p>
+      <w:pPr>
+        <w:spacing w:line="360" w:lineRule="exact" w:before="0" w:after="0"/>
+        <w:ind w:firstLine="420"/>
+        <w:jc w:val="both"/>
+      </w:pPr>
+      <w:r>
+        <w:rPr>
+          <w:rFonts w:ascii="Times New Roman" w:hAnsi="Times New Roman" w:eastAsia="宋体"/>
+          <w:b w:val="0"/>
+          <w:i w:val="0"/>
+          <w:sz w:val="21"/>
+        </w:rPr>
+        <w:t>因此，实际系统往往需要在多个目标之间取得平衡：一方面希望模型输出尽可能准确，降低 DER；另一方面又希望系统具备较好的响应速度、稳定性和可部署性。本课题使用 fast baseline 与 slow baseline 的双基线结构，正是为了把速度和质量两个维度都纳入最终框架。</w:t>
       </w:r>
     </w:p>
     <w:p>
@@ -1646,39 +1822,104 @@
           <w:i w:val="0"/>
           <w:sz w:val="21"/>
         </w:rPr>
-        <w:t>2.2 AliMeeting 数据集与评估指标</w:t>
-      </w:r>
-    </w:p>
-    <w:p>
-      <w:pPr>
-        <w:spacing w:line="360" w:lineRule="exact" w:before="0" w:after="0"/>
-        <w:ind w:firstLine="420"/>
-        <w:jc w:val="both"/>
-      </w:pPr>
-      <w:r>
-        <w:rPr>
-          <w:rFonts w:ascii="Times New Roman" w:hAnsi="Times New Roman" w:eastAsia="宋体"/>
-          <w:b w:val="0"/>
-          <w:i w:val="0"/>
-          <w:sz w:val="21"/>
-        </w:rPr>
-        <w:t>AliMeeting 是面向中文会议语音处理的重要公开数据集，包含真实多人会议录音，并支持说话人分离和多说话人语音识别等任务。本课题最终离线复现实验使用 AliMeeting Eval set 的 8 条录音，共 120 个 30 秒评估窗口，评估音频总量为 3600.0 秒 cached-window audio。</w:t>
-      </w:r>
-    </w:p>
-    <w:p>
-      <w:pPr>
-        <w:spacing w:line="360" w:lineRule="exact" w:before="0" w:after="0"/>
-        <w:ind w:firstLine="420"/>
-        <w:jc w:val="both"/>
-      </w:pPr>
-      <w:r>
-        <w:rPr>
-          <w:rFonts w:ascii="Times New Roman" w:hAnsi="Times New Roman" w:eastAsia="宋体"/>
-          <w:b w:val="0"/>
-          <w:i w:val="0"/>
-          <w:sz w:val="21"/>
-        </w:rPr>
-        <w:t>系统主要使用 DER（Diarization Error Rate）作为评价指标。DER 通常由 Miss、False Alarm 和 Confusion 三部分组成，能够综合反映漏检、误检和说话人混淆情况。本课题同时报告 baseline 对比、实时性代理参数、离线 replay RTF、regression 通过情况和自检结果，以避免只用单一指标判断系统质量。</w:t>
+        <w:t>2.2 AliMeeting 数据集</w:t>
+      </w:r>
+    </w:p>
+    <w:p>
+      <w:pPr>
+        <w:spacing w:line="360" w:lineRule="exact" w:before="0" w:after="0"/>
+        <w:ind w:firstLine="420"/>
+        <w:jc w:val="both"/>
+      </w:pPr>
+      <w:r>
+        <w:rPr>
+          <w:rFonts w:ascii="Times New Roman" w:hAnsi="Times New Roman" w:eastAsia="宋体"/>
+          <w:b w:val="0"/>
+          <w:i w:val="0"/>
+          <w:sz w:val="21"/>
+        </w:rPr>
+        <w:t>AliMeeting 是面向中文会议语音处理的重要公开数据集，包含真实会议场景中的多说话人录音，支持说话人分离和多说话人语音识别等任务。与合成语音或理想录音不同，AliMeeting 更接近真实会议环境，具有多人交互、远场采集和自然对话等特点，因此适合作为会议语音理解系统的评测基础。</w:t>
+      </w:r>
+    </w:p>
+    <w:p>
+      <w:pPr>
+        <w:spacing w:line="360" w:lineRule="exact" w:before="0" w:after="0"/>
+        <w:ind w:firstLine="420"/>
+        <w:jc w:val="both"/>
+      </w:pPr>
+      <w:r>
+        <w:rPr>
+          <w:rFonts w:ascii="Times New Roman" w:hAnsi="Times New Roman" w:eastAsia="宋体"/>
+          <w:b w:val="0"/>
+          <w:i w:val="0"/>
+          <w:sz w:val="21"/>
+        </w:rPr>
+        <w:t>本课题最终离线复现实验使用 AliMeeting Eval set 的 8 条录音，并按 30 秒窗口组织为 120 个评估窗口。评估音频总量为 3600.0 秒 cached-window audio。当前结果定位为 development-pool result，即结论限定在当前评估池与当前冻结的同窗口 baseline 集合上，不将其表述为未知数据上的泛化最优。</w:t>
+      </w:r>
+    </w:p>
+    <w:p>
+      <w:pPr>
+        <w:spacing w:line="360" w:lineRule="exact" w:before="0" w:after="0"/>
+        <w:ind w:firstLine="420"/>
+        <w:jc w:val="both"/>
+      </w:pPr>
+      <w:r>
+        <w:rPr>
+          <w:rFonts w:ascii="Times New Roman" w:hAnsi="Times New Roman" w:eastAsia="宋体"/>
+          <w:b w:val="0"/>
+          <w:i w:val="0"/>
+          <w:sz w:val="21"/>
+        </w:rPr>
+        <w:t>这种限定是必要的。说话人分离系统容易受到录音条件、说话人数、语音重叠比例和会议风格影响。如果没有 sealed true-heldout split，仅凭 development-pool 上的结果不能完全说明泛化能力。因此，本文在报告最终指标的同时，也明确保留 promotion boundary 和后续验证方向。</w:t>
+      </w:r>
+    </w:p>
+    <w:p>
+      <w:pPr>
+        <w:pStyle w:val="3"/>
+        <w:spacing w:line="360" w:lineRule="exact" w:before="180" w:after="180"/>
+        <w:ind w:firstLine="420"/>
+        <w:jc w:val="left"/>
+      </w:pPr>
+      <w:r>
+        <w:rPr>
+          <w:rFonts w:ascii="Times New Roman" w:hAnsi="Times New Roman" w:eastAsia="黑体"/>
+          <w:b/>
+          <w:i w:val="0"/>
+          <w:sz w:val="21"/>
+        </w:rPr>
+        <w:t>2.3 相关模型与系统基础</w:t>
+      </w:r>
+    </w:p>
+    <w:p>
+      <w:pPr>
+        <w:spacing w:line="360" w:lineRule="exact" w:before="0" w:after="0"/>
+        <w:ind w:firstLine="420"/>
+        <w:jc w:val="both"/>
+      </w:pPr>
+      <w:r>
+        <w:rPr>
+          <w:rFonts w:ascii="Times New Roman" w:hAnsi="Times New Roman" w:eastAsia="宋体"/>
+          <w:b w:val="0"/>
+          <w:i w:val="0"/>
+          <w:sz w:val="21"/>
+        </w:rPr>
+        <w:t>本课题的最终系统主要基于两类 diarization 输出：Sortformer fast baseline 与 DiariZen slow baseline。Sortformer 代表快速基础输出路径，适合作为低延迟场景和 fallback 参考；DiariZen 则基于更强的说话人分离 pipeline，在当前评估池中取得明显更低的 DER。</w:t>
+      </w:r>
+    </w:p>
+    <w:p>
+      <w:pPr>
+        <w:spacing w:line="360" w:lineRule="exact" w:before="0" w:after="0"/>
+        <w:ind w:firstLine="420"/>
+        <w:jc w:val="both"/>
+      </w:pPr>
+      <w:r>
+        <w:rPr>
+          <w:rFonts w:ascii="Times New Roman" w:hAnsi="Times New Roman" w:eastAsia="宋体"/>
+          <w:b w:val="0"/>
+          <w:i w:val="0"/>
+          <w:sz w:val="21"/>
+        </w:rPr>
+        <w:t>除这两个核心基线外，项目代码包中还保留了 PyAnnote、PyAnnote Community、Fun-ASR、Paraformer v2、ASR Flash、Omni Plus 和 GPT-4o audio adapter 等模型适配器，便于后续扩展实验。但最终默认交付系统不依赖这些在线或额外模型路径，不调用 live API，而是通过 frozen artifacts 复现当前结果。</w:t>
       </w:r>
     </w:p>
     <w:p>
@@ -1728,23 +1969,39 @@
           <w:i w:val="0"/>
           <w:sz w:val="21"/>
         </w:rPr>
-        <w:t>DER 是说话人分离任务最常用的评价指标之一，可理解为系统错误时间占参考说话人时间的比例。其主要错误来源包括：Miss，即参考中有人说话但系统未检测到；False Alarm，即系统检测到说话但参考中没有；Confusion，即系统检测到语音但分配给了错误说话人。</w:t>
-      </w:r>
-    </w:p>
-    <w:p>
-      <w:pPr>
-        <w:spacing w:line="360" w:lineRule="exact" w:before="0" w:after="0"/>
-        <w:ind w:firstLine="420"/>
-        <w:jc w:val="both"/>
-      </w:pPr>
-      <w:r>
-        <w:rPr>
-          <w:rFonts w:ascii="Times New Roman" w:hAnsi="Times New Roman" w:eastAsia="宋体"/>
-          <w:b w:val="0"/>
-          <w:i w:val="0"/>
-          <w:sz w:val="21"/>
-        </w:rPr>
-        <w:t>本课题最终系统的 Miss、FA、Confusion 分别为 5.2621%、6.3883% 和 4.8431%。这些分项指标说明，最终错误并非来自单一来源，而是分布在漏检、误检和混淆三个方面。因此，增强系统不能只做简单阈值调节，而需要结合模型输出、局部证据和安全门控进行综合判断。</w:t>
+        <w:t>DER（Diarization Error Rate）是说话人分离任务中最常用的指标之一，可理解为系统错误时间占参考说话人时间的比例。其主要由 Miss、False Alarm 和 Confusion 三部分组成。Miss 表示参考中有人说话但系统未检测到；False Alarm 表示系统检测到说话但参考中没有对应语音；Confusion 表示系统检测到语音但分配给了错误说话人。</w:t>
+      </w:r>
+    </w:p>
+    <w:p>
+      <w:pPr>
+        <w:spacing w:line="360" w:lineRule="exact" w:before="0" w:after="0"/>
+        <w:ind w:firstLine="420"/>
+        <w:jc w:val="both"/>
+      </w:pPr>
+      <w:r>
+        <w:rPr>
+          <w:rFonts w:ascii="Times New Roman" w:hAnsi="Times New Roman" w:eastAsia="宋体"/>
+          <w:b w:val="0"/>
+          <w:i w:val="0"/>
+          <w:sz w:val="21"/>
+        </w:rPr>
+        <w:t>在会议语音中，这三类错误往往同时存在。例如，在重叠语音或弱能量片段中，系统可能漏掉某个说话人的发言，从而产生 Miss；在静音或噪声区域，如果系统误判为语音，则产生 False Alarm；在多人快速轮换场景中，系统可能把一个短片段归到错误说话人，产生 Confusion。</w:t>
+      </w:r>
+    </w:p>
+    <w:p>
+      <w:pPr>
+        <w:spacing w:line="360" w:lineRule="exact" w:before="0" w:after="0"/>
+        <w:ind w:firstLine="420"/>
+        <w:jc w:val="both"/>
+      </w:pPr>
+      <w:r>
+        <w:rPr>
+          <w:rFonts w:ascii="Times New Roman" w:hAnsi="Times New Roman" w:eastAsia="宋体"/>
+          <w:b w:val="0"/>
+          <w:i w:val="0"/>
+          <w:sz w:val="21"/>
+        </w:rPr>
+        <w:t>本课题最终系统的 Miss、FA、Confusion 分别为 5.2621%、6.3883% 和 4.8431%。这些分项指标说明，系统剩余错误并非来自单一来源，而是分布在漏检、误检和混淆三个方面。因此，最终增强策略不能只依赖单个阈值或单一规则，而需要结合基线输出、局部证据和安全门控。</w:t>
       </w:r>
     </w:p>
     <w:p>
@@ -1761,39 +2018,137 @@
           <w:i w:val="0"/>
           <w:sz w:val="21"/>
         </w:rPr>
-        <w:t>3.2 双基线融合与离线增强思想</w:t>
-      </w:r>
-    </w:p>
-    <w:p>
-      <w:pPr>
-        <w:spacing w:line="360" w:lineRule="exact" w:before="0" w:after="0"/>
-        <w:ind w:firstLine="420"/>
-        <w:jc w:val="both"/>
-      </w:pPr>
-      <w:r>
-        <w:rPr>
-          <w:rFonts w:ascii="Times New Roman" w:hAnsi="Times New Roman" w:eastAsia="宋体"/>
-          <w:b w:val="0"/>
-          <w:i w:val="0"/>
-          <w:sz w:val="21"/>
-        </w:rPr>
-        <w:t>本课题不重新训练一个单一模型，而是在 Sortformer 快速基线和 DiariZen 高质量慢速基线之上构建离线增强层。Sortformer 提供快速基础输出，适合作为实时路径和 fallback 参考；DiariZen 的整体 DER 更低，适合作为 slow-first 主路径。</w:t>
-      </w:r>
-    </w:p>
-    <w:p>
-      <w:pPr>
-        <w:spacing w:line="360" w:lineRule="exact" w:before="0" w:after="0"/>
-        <w:ind w:firstLine="420"/>
-        <w:jc w:val="both"/>
-      </w:pPr>
-      <w:r>
-        <w:rPr>
-          <w:rFonts w:ascii="Times New Roman" w:hAnsi="Times New Roman" w:eastAsia="宋体"/>
-          <w:b w:val="0"/>
-          <w:i w:val="0"/>
-          <w:sz w:val="21"/>
-        </w:rPr>
-        <w:t>最终系统读取冻结的离线 artifacts，包括 gates、guards、patch evidence 和 selector evidence。LLM/agent 的作用被放置在离线准备阶段，而不是运行时在线调用。这样可以避免外部 API、网络状态和模型版本变化影响复现实验。默认交付系统 live API calls 为 0。</w:t>
+        <w:t>3.2 双基线融合思想</w:t>
+      </w:r>
+    </w:p>
+    <w:p>
+      <w:pPr>
+        <w:spacing w:line="360" w:lineRule="exact" w:before="0" w:after="0"/>
+        <w:ind w:firstLine="420"/>
+        <w:jc w:val="both"/>
+      </w:pPr>
+      <w:r>
+        <w:rPr>
+          <w:rFonts w:ascii="Times New Roman" w:hAnsi="Times New Roman" w:eastAsia="宋体"/>
+          <w:b w:val="0"/>
+          <w:i w:val="0"/>
+          <w:sz w:val="21"/>
+        </w:rPr>
+        <w:t>单一模型的 diarization timeline 通常具有固定的偏好和错误模式。快速模型可能响应更快，但在复杂片段上的错误较多；高质量模型整体更稳，但也可能在局部边界或短时片段上做出不必要的修改。因此，本课题采用双基线融合思想，将 Sortformer 与 DiariZen 的 cached outputs 同时作为系统输入。</w:t>
+      </w:r>
+    </w:p>
+    <w:p>
+      <w:pPr>
+        <w:spacing w:line="360" w:lineRule="exact" w:before="0" w:after="0"/>
+        <w:ind w:firstLine="420"/>
+        <w:jc w:val="both"/>
+      </w:pPr>
+      <w:r>
+        <w:rPr>
+          <w:rFonts w:ascii="Times New Roman" w:hAnsi="Times New Roman" w:eastAsia="宋体"/>
+          <w:b w:val="0"/>
+          <w:i w:val="0"/>
+          <w:sz w:val="21"/>
+        </w:rPr>
+        <w:t>双基线融合并不是简单地对两个输出求平均，也不是在每个窗口上无约束地选择 DER 更低的候选。真正可交付的系统不能依赖评测答案做事后挑选，而应当通过离线证据、规则边界和风险控制来决定最终输出。因此，本课题采用 slow-first selector，以 DiariZen 的强基线优势作为主路径，并在风险条件下保留 fallback 能力。</w:t>
+      </w:r>
+    </w:p>
+    <w:p>
+      <w:pPr>
+        <w:pStyle w:val="3"/>
+        <w:spacing w:line="360" w:lineRule="exact" w:before="180" w:after="180"/>
+        <w:ind w:firstLine="420"/>
+        <w:jc w:val="left"/>
+      </w:pPr>
+      <w:r>
+        <w:rPr>
+          <w:rFonts w:ascii="Times New Roman" w:hAnsi="Times New Roman" w:eastAsia="黑体"/>
+          <w:b/>
+          <w:i w:val="0"/>
+          <w:sz w:val="21"/>
+        </w:rPr>
+        <w:t>3.3 离线 LLM/Agent 证据注入</w:t>
+      </w:r>
+    </w:p>
+    <w:p>
+      <w:pPr>
+        <w:spacing w:line="360" w:lineRule="exact" w:before="0" w:after="0"/>
+        <w:ind w:firstLine="420"/>
+        <w:jc w:val="both"/>
+      </w:pPr>
+      <w:r>
+        <w:rPr>
+          <w:rFonts w:ascii="Times New Roman" w:hAnsi="Times New Roman" w:eastAsia="宋体"/>
+          <w:b w:val="0"/>
+          <w:i w:val="0"/>
+          <w:sz w:val="21"/>
+        </w:rPr>
+        <w:t>项目早期探索过 LLM 或 agent 在策略搜索、patch evidence 整理和规则候选生成中的作用。最终交付版本没有把 LLM 放在运行时在线调用链路中，而是将相关结果冻结为本地 artifacts，包括 gates、guards、patch evidence 和 selector evidence。</w:t>
+      </w:r>
+    </w:p>
+    <w:p>
+      <w:pPr>
+        <w:spacing w:line="360" w:lineRule="exact" w:before="0" w:after="0"/>
+        <w:ind w:firstLine="420"/>
+        <w:jc w:val="both"/>
+      </w:pPr>
+      <w:r>
+        <w:rPr>
+          <w:rFonts w:ascii="Times New Roman" w:hAnsi="Times New Roman" w:eastAsia="宋体"/>
+          <w:b w:val="0"/>
+          <w:i w:val="0"/>
+          <w:sz w:val="21"/>
+        </w:rPr>
+        <w:t>这种设计的核心优点是稳定和可复现。若系统运行时依赖外部 API，则结果可能受到网络状态、模型版本、计费限制和服务可用性的影响；而将 LLM/agent 的作用前移到离线准备阶段，则可以在交付时固定输入和输出，使老师或评审能够在没有 API key 的情况下复现默认结果。</w:t>
+      </w:r>
+    </w:p>
+    <w:p>
+      <w:pPr>
+        <w:pStyle w:val="3"/>
+        <w:spacing w:line="360" w:lineRule="exact" w:before="180" w:after="180"/>
+        <w:ind w:firstLine="420"/>
+        <w:jc w:val="left"/>
+      </w:pPr>
+      <w:r>
+        <w:rPr>
+          <w:rFonts w:ascii="Times New Roman" w:hAnsi="Times New Roman" w:eastAsia="黑体"/>
+          <w:b/>
+          <w:i w:val="0"/>
+          <w:sz w:val="21"/>
+        </w:rPr>
+        <w:t>3.4 Guard 与可回退机制</w:t>
+      </w:r>
+    </w:p>
+    <w:p>
+      <w:pPr>
+        <w:spacing w:line="360" w:lineRule="exact" w:before="0" w:after="0"/>
+        <w:ind w:firstLine="420"/>
+        <w:jc w:val="both"/>
+      </w:pPr>
+      <w:r>
+        <w:rPr>
+          <w:rFonts w:ascii="Times New Roman" w:hAnsi="Times New Roman" w:eastAsia="宋体"/>
+          <w:b w:val="0"/>
+          <w:i w:val="0"/>
+          <w:sz w:val="21"/>
+        </w:rPr>
+        <w:t>增强系统最重要的风险在于负收益：某个局部规则看似能修复少数窗口，却可能在其他窗口引入更多错误。为避免这一问题，本文系统引入 guard/quarantine gate。只有具备充分离线证据、符合完整性约束且不会破坏 timeline 的修改，才能进入最终输出。</w:t>
+      </w:r>
+    </w:p>
+    <w:p>
+      <w:pPr>
+        <w:spacing w:line="360" w:lineRule="exact" w:before="0" w:after="0"/>
+        <w:ind w:firstLine="420"/>
+        <w:jc w:val="both"/>
+      </w:pPr>
+      <w:r>
+        <w:rPr>
+          <w:rFonts w:ascii="Times New Roman" w:hAnsi="Times New Roman" w:eastAsia="宋体"/>
+          <w:b w:val="0"/>
+          <w:i w:val="0"/>
+          <w:sz w:val="21"/>
+        </w:rPr>
+        <w:t>同时，系统保留 safe fast fallback。当 slow-first 输出或局部增强存在风险时，fallback 机制允许系统回退到更安全的候选输出。这样最终系统不是一味追求激进提升，而是在可控边界内做少量高置信修正。</w:t>
       </w:r>
     </w:p>
     <w:p>
@@ -1815,153 +2170,9 @@
     </w:p>
     <w:p>
       <w:pPr>
-        <w:spacing w:line="360" w:lineRule="exact" w:before="0" w:after="0"/>
-        <w:ind w:firstLine="420"/>
-        <w:jc w:val="both"/>
-      </w:pPr>
-      <w:r>
-        <w:rPr>
-          <w:rFonts w:ascii="Times New Roman" w:hAnsi="Times New Roman" w:eastAsia="宋体"/>
-          <w:b w:val="0"/>
-          <w:i w:val="0"/>
-          <w:sz w:val="21"/>
-        </w:rPr>
-        <w:t>本课题围绕“强基线之上的可控增强”展开，最终系统命名为 slow_guarded_fast_fallback_rare_audio_rule_recover。主要完成了以下工作：</w:t>
-      </w:r>
-    </w:p>
-    <w:p>
-      <w:pPr>
-        <w:spacing w:line="360" w:lineRule="exact" w:before="0" w:after="0"/>
-        <w:ind w:firstLine="420"/>
-        <w:jc w:val="both"/>
-      </w:pPr>
-      <w:r>
-        <w:rPr>
-          <w:rFonts w:ascii="Times New Roman" w:hAnsi="Times New Roman" w:eastAsia="宋体"/>
-          <w:b w:val="0"/>
-          <w:i w:val="0"/>
-          <w:sz w:val="21"/>
-        </w:rPr>
-        <w:t>（1）整理 AliMeeting diarization benchmark package，将运行入口、模型适配器、评估逻辑、指标计算和最终系统模块统一为 Python 包。</w:t>
-      </w:r>
-    </w:p>
-    <w:p>
-      <w:pPr>
-        <w:spacing w:line="360" w:lineRule="exact" w:before="0" w:after="0"/>
-        <w:ind w:firstLine="420"/>
-        <w:jc w:val="both"/>
-      </w:pPr>
-      <w:r>
-        <w:rPr>
-          <w:rFonts w:ascii="Times New Roman" w:hAnsi="Times New Roman" w:eastAsia="宋体"/>
-          <w:b w:val="0"/>
-          <w:i w:val="0"/>
-          <w:sz w:val="21"/>
-        </w:rPr>
-        <w:t>（2）建立 Sortformer 与 DiariZen 两类基线输出，并将其作为最终增强系统的基础输入。</w:t>
-      </w:r>
-    </w:p>
-    <w:p>
-      <w:pPr>
-        <w:spacing w:line="360" w:lineRule="exact" w:before="0" w:after="0"/>
-        <w:ind w:firstLine="420"/>
-        <w:jc w:val="both"/>
-      </w:pPr>
-      <w:r>
-        <w:rPr>
-          <w:rFonts w:ascii="Times New Roman" w:hAnsi="Times New Roman" w:eastAsia="宋体"/>
-          <w:b w:val="0"/>
-          <w:i w:val="0"/>
-          <w:sz w:val="21"/>
-        </w:rPr>
-        <w:t>（3）设计 slow-first selector，使系统优先利用 DiariZen 的强基线优势，同时避免在风险窗口中盲目修改。</w:t>
-      </w:r>
-    </w:p>
-    <w:p>
-      <w:pPr>
-        <w:spacing w:line="360" w:lineRule="exact" w:before="0" w:after="0"/>
-        <w:ind w:firstLine="420"/>
-        <w:jc w:val="both"/>
-      </w:pPr>
-      <w:r>
-        <w:rPr>
-          <w:rFonts w:ascii="Times New Roman" w:hAnsi="Times New Roman" w:eastAsia="宋体"/>
-          <w:b w:val="0"/>
-          <w:i w:val="0"/>
-          <w:sz w:val="21"/>
-        </w:rPr>
-        <w:t>（4）引入 safe fast fallback，在高风险场景中回退到更安全的候选输出，减少增强层造成负收益的可能性。</w:t>
-      </w:r>
-    </w:p>
-    <w:p>
-      <w:pPr>
-        <w:spacing w:line="360" w:lineRule="exact" w:before="0" w:after="0"/>
-        <w:ind w:firstLine="420"/>
-        <w:jc w:val="both"/>
-      </w:pPr>
-      <w:r>
-        <w:rPr>
-          <w:rFonts w:ascii="Times New Roman" w:hAnsi="Times New Roman" w:eastAsia="宋体"/>
-          <w:b w:val="0"/>
-          <w:i w:val="0"/>
-          <w:sz w:val="21"/>
-        </w:rPr>
-        <w:t>（5）构建 sparse rule-recover overlay，仅允许少量高置信、可解释的局部修正进入最终 timeline。</w:t>
-      </w:r>
-    </w:p>
-    <w:p>
-      <w:pPr>
-        <w:spacing w:line="360" w:lineRule="exact" w:before="0" w:after="0"/>
-        <w:ind w:firstLine="420"/>
-        <w:jc w:val="both"/>
-      </w:pPr>
-      <w:r>
-        <w:rPr>
-          <w:rFonts w:ascii="Times New Roman" w:hAnsi="Times New Roman" w:eastAsia="宋体"/>
-          <w:b w:val="0"/>
-          <w:i w:val="0"/>
-          <w:sz w:val="21"/>
-        </w:rPr>
-        <w:t>（6）加入 guard/quarantine gate，对缺少证据或可能破坏 timeline 完整性的修改进行阻断或隔离。</w:t>
-      </w:r>
-    </w:p>
-    <w:p>
-      <w:pPr>
-        <w:spacing w:line="360" w:lineRule="exact" w:before="0" w:after="0"/>
-        <w:ind w:firstLine="420"/>
-        <w:jc w:val="both"/>
-      </w:pPr>
-      <w:r>
-        <w:rPr>
-          <w:rFonts w:ascii="Times New Roman" w:hAnsi="Times New Roman" w:eastAsia="宋体"/>
-          <w:b w:val="0"/>
-          <w:i w:val="0"/>
-          <w:sz w:val="21"/>
-        </w:rPr>
-        <w:t>（7）形成 quick start、batch、regression、自检、timeline integrity、baseline audit 和 promotion gate 等交付验证入口。</w:t>
-      </w:r>
-    </w:p>
-    <w:p>
-      <w:pPr>
-        <w:spacing w:line="360" w:lineRule="exact" w:before="0" w:after="0"/>
-        <w:ind w:firstLine="420"/>
-        <w:jc w:val="both"/>
-      </w:pPr>
-      <w:r>
-        <w:rPr>
-          <w:rFonts w:ascii="Times New Roman" w:hAnsi="Times New Roman" w:eastAsia="宋体"/>
-          <w:b w:val="0"/>
-          <w:i w:val="0"/>
-          <w:sz w:val="21"/>
-        </w:rPr>
-        <w:t>最终系统框架可概括为：AliMeeting 评估音频窗口进入 Sortformer 与 DiariZen cached outputs，两路输出和离线证据共同进入 offline enhancement runtime，经过 selector、fallback、rule recover 和 guard gate 后生成最终 diarization timeline，并输出 RTTM、CSV、JSON metrics 和审计报告。</w:t>
-      </w:r>
-    </w:p>
-    <w:p>
-      <w:pPr>
-        <w:pStyle w:val="2"/>
+        <w:pStyle w:val="3"/>
         <w:spacing w:line="360" w:lineRule="exact" w:before="180" w:after="180"/>
-        <w:ind w:firstLine="0"/>
+        <w:ind w:firstLine="420"/>
         <w:jc w:val="left"/>
       </w:pPr>
       <w:r>
@@ -1971,23 +2182,88 @@
           <w:i w:val="0"/>
           <w:sz w:val="21"/>
         </w:rPr>
-        <w:t>5 仿真结果（包括性能指标）</w:t>
-      </w:r>
-    </w:p>
-    <w:p>
-      <w:pPr>
-        <w:spacing w:line="360" w:lineRule="exact" w:before="0" w:after="0"/>
-        <w:ind w:firstLine="420"/>
-        <w:jc w:val="both"/>
-      </w:pPr>
-      <w:r>
-        <w:rPr>
-          <w:rFonts w:ascii="Times New Roman" w:hAnsi="Times New Roman" w:eastAsia="宋体"/>
-          <w:b w:val="0"/>
-          <w:i w:val="0"/>
-          <w:sz w:val="21"/>
-        </w:rPr>
-        <w:t>本课题使用 frozen cached outputs 与 frozen artifacts 进行离线 replay。这样做的目的不是规避模型推理，而是保证课程交付版本在不同机器上可以稳定复现同一组结果。核心实验配置如下表所示。</w:t>
+        <w:t>4.1 数据与基线整理</w:t>
+      </w:r>
+    </w:p>
+    <w:p>
+      <w:pPr>
+        <w:spacing w:line="360" w:lineRule="exact" w:before="0" w:after="0"/>
+        <w:ind w:firstLine="420"/>
+        <w:jc w:val="both"/>
+      </w:pPr>
+      <w:r>
+        <w:rPr>
+          <w:rFonts w:ascii="Times New Roman" w:hAnsi="Times New Roman" w:eastAsia="宋体"/>
+          <w:b w:val="0"/>
+          <w:i w:val="0"/>
+          <w:sz w:val="21"/>
+        </w:rPr>
+        <w:t>本课题首先整理 AliMeeting Eval set 的评估输入和 cached model outputs，形成统一的窗口级评估池。最终评估池包含 8 条录音、120 个 30 秒窗口。为保证复现稳定性，最终交付版本保留 Sortformer 和 DiariZen 的 cached summary、timeline 输出和评估结果，而不是要求每次从原始模型重新推理。</w:t>
+      </w:r>
+    </w:p>
+    <w:p>
+      <w:pPr>
+        <w:spacing w:line="360" w:lineRule="exact" w:before="0" w:after="0"/>
+        <w:ind w:firstLine="420"/>
+        <w:jc w:val="both"/>
+      </w:pPr>
+      <w:r>
+        <w:rPr>
+          <w:rFonts w:ascii="Times New Roman" w:hAnsi="Times New Roman" w:eastAsia="宋体"/>
+          <w:b w:val="0"/>
+          <w:i w:val="0"/>
+          <w:sz w:val="21"/>
+        </w:rPr>
+        <w:t>在基线方面，Sortformer fast baseline 的 DER 为 28.5637%，DiariZen slow baseline 的 DER 为 16.8809%。这两个结果构成最终增强系统的主要对照组，也说明仅依赖快速模型会损失明显精度，而慢速模型虽然强，但仍存在进一步局部优化空间。</w:t>
+      </w:r>
+    </w:p>
+    <w:p>
+      <w:pPr>
+        <w:pStyle w:val="3"/>
+        <w:spacing w:line="360" w:lineRule="exact" w:before="180" w:after="180"/>
+        <w:ind w:firstLine="420"/>
+        <w:jc w:val="left"/>
+      </w:pPr>
+      <w:r>
+        <w:rPr>
+          <w:rFonts w:ascii="Times New Roman" w:hAnsi="Times New Roman" w:eastAsia="黑体"/>
+          <w:b/>
+          <w:i w:val="0"/>
+          <w:sz w:val="21"/>
+        </w:rPr>
+        <w:t>4.2 最终系统框架设计</w:t>
+      </w:r>
+    </w:p>
+    <w:p>
+      <w:pPr>
+        <w:spacing w:line="360" w:lineRule="exact" w:before="0" w:after="0"/>
+        <w:ind w:firstLine="420"/>
+        <w:jc w:val="both"/>
+      </w:pPr>
+      <w:r>
+        <w:rPr>
+          <w:rFonts w:ascii="Times New Roman" w:hAnsi="Times New Roman" w:eastAsia="宋体"/>
+          <w:b w:val="0"/>
+          <w:i w:val="0"/>
+          <w:sz w:val="21"/>
+        </w:rPr>
+        <w:t>最终系统命名为 slow_guarded_fast_fallback_rare_audio_rule_recover。其主要流程为：读取 AliMeeting 评估窗口和基线输出，加载 frozen LLM/agent-prepared artifacts，执行 slow-first selector，必要时使用 safe fast fallback，对少量高置信窗口应用 sparse rule-recover overlay，最后通过 guard/quarantine gate 输出最终 timeline。</w:t>
+      </w:r>
+    </w:p>
+    <w:p>
+      <w:pPr>
+        <w:spacing w:line="360" w:lineRule="exact" w:before="0" w:after="0"/>
+        <w:ind w:firstLine="420"/>
+        <w:jc w:val="both"/>
+      </w:pPr>
+      <w:r>
+        <w:rPr>
+          <w:rFonts w:ascii="Times New Roman" w:hAnsi="Times New Roman" w:eastAsia="宋体"/>
+          <w:b w:val="0"/>
+          <w:i w:val="0"/>
+          <w:sz w:val="21"/>
+        </w:rPr>
+        <w:t>系统输出包括 RTTM、CSV、JSON metrics、baseline comparison、timeline integrity report 和 self-check report。相比单纯输出一个 DER 数值，这种设计能够让每一步修改都有迹可循，也便于后续定位系统收益来自哪里、风险边界在哪里。</w:t>
       </w:r>
     </w:p>
     <w:tbl>
@@ -2002,7 +2278,7 @@
       <w:tr>
         <w:tc>
           <w:tcPr>
-            <w:tcW w:type="dxa" w:w="2880"/>
+            <w:tcW w:type="dxa" w:w="3311"/>
             <w:shd w:fill="EDEDED"/>
             <w:vAlign w:val="center"/>
           </w:tcPr>
@@ -2019,13 +2295,13 @@
                 <w:i w:val="0"/>
                 <w:sz w:val="21"/>
               </w:rPr>
-              <w:t>项目</w:t>
-            </w:r>
-          </w:p>
-        </w:tc>
-        <w:tc>
-          <w:tcPr>
-            <w:tcW w:type="dxa" w:w="6336"/>
+              <w:t>模块</w:t>
+            </w:r>
+          </w:p>
+        </w:tc>
+        <w:tc>
+          <w:tcPr>
+            <w:tcW w:type="dxa" w:w="5903"/>
             <w:shd w:fill="EDEDED"/>
             <w:vAlign w:val="center"/>
           </w:tcPr>
@@ -2042,7 +2318,7 @@
                 <w:i w:val="0"/>
                 <w:sz w:val="21"/>
               </w:rPr>
-              <w:t>设置</w:t>
+              <w:t>作用</w:t>
             </w:r>
           </w:p>
         </w:tc>
@@ -2050,45 +2326,45 @@
       <w:tr>
         <w:tc>
           <w:tcPr>
-            <w:tcW w:type="dxa" w:w="2880"/>
-            <w:vAlign w:val="center"/>
-          </w:tcPr>
-          <w:p>
-            <w:pPr>
-              <w:spacing w:line="360" w:lineRule="exact"/>
-              <w:jc w:val="left"/>
-            </w:pPr>
-            <w:r/>
-            <w:r>
-              <w:rPr>
-                <w:rFonts w:ascii="Times New Roman" w:hAnsi="Times New Roman" w:eastAsia="宋体"/>
-                <w:b w:val="0"/>
-                <w:i w:val="0"/>
-                <w:sz w:val="21"/>
-              </w:rPr>
-              <w:t>数据集</w:t>
-            </w:r>
-          </w:p>
-        </w:tc>
-        <w:tc>
-          <w:tcPr>
-            <w:tcW w:type="dxa" w:w="6336"/>
-            <w:vAlign w:val="center"/>
-          </w:tcPr>
-          <w:p>
-            <w:pPr>
-              <w:spacing w:line="360" w:lineRule="exact"/>
-              <w:jc w:val="left"/>
-            </w:pPr>
-            <w:r/>
-            <w:r>
-              <w:rPr>
-                <w:rFonts w:ascii="Times New Roman" w:hAnsi="Times New Roman" w:eastAsia="宋体"/>
-                <w:b w:val="0"/>
-                <w:i w:val="0"/>
-                <w:sz w:val="21"/>
-              </w:rPr>
-              <w:t>AliMeeting</w:t>
+            <w:tcW w:type="dxa" w:w="3311"/>
+            <w:vAlign w:val="center"/>
+          </w:tcPr>
+          <w:p>
+            <w:pPr>
+              <w:spacing w:line="360" w:lineRule="exact"/>
+              <w:jc w:val="left"/>
+            </w:pPr>
+            <w:r/>
+            <w:r>
+              <w:rPr>
+                <w:rFonts w:ascii="Times New Roman" w:hAnsi="Times New Roman" w:eastAsia="宋体"/>
+                <w:b w:val="0"/>
+                <w:i w:val="0"/>
+                <w:sz w:val="21"/>
+              </w:rPr>
+              <w:t>Sortformer cached output</w:t>
+            </w:r>
+          </w:p>
+        </w:tc>
+        <w:tc>
+          <w:tcPr>
+            <w:tcW w:type="dxa" w:w="5903"/>
+            <w:vAlign w:val="center"/>
+          </w:tcPr>
+          <w:p>
+            <w:pPr>
+              <w:spacing w:line="360" w:lineRule="exact"/>
+              <w:jc w:val="left"/>
+            </w:pPr>
+            <w:r/>
+            <w:r>
+              <w:rPr>
+                <w:rFonts w:ascii="Times New Roman" w:hAnsi="Times New Roman" w:eastAsia="宋体"/>
+                <w:b w:val="0"/>
+                <w:i w:val="0"/>
+                <w:sz w:val="21"/>
+              </w:rPr>
+              <w:t>提供快速基础 diarization 输出，用于 fast baseline 和 fallback 参考。</w:t>
             </w:r>
           </w:p>
         </w:tc>
@@ -2096,45 +2372,45 @@
       <w:tr>
         <w:tc>
           <w:tcPr>
-            <w:tcW w:type="dxa" w:w="2880"/>
-            <w:vAlign w:val="center"/>
-          </w:tcPr>
-          <w:p>
-            <w:pPr>
-              <w:spacing w:line="360" w:lineRule="exact"/>
-              <w:jc w:val="left"/>
-            </w:pPr>
-            <w:r/>
-            <w:r>
-              <w:rPr>
-                <w:rFonts w:ascii="Times New Roman" w:hAnsi="Times New Roman" w:eastAsia="宋体"/>
-                <w:b w:val="0"/>
-                <w:i w:val="0"/>
-                <w:sz w:val="21"/>
-              </w:rPr>
-              <w:t>使用划分</w:t>
-            </w:r>
-          </w:p>
-        </w:tc>
-        <w:tc>
-          <w:tcPr>
-            <w:tcW w:type="dxa" w:w="6336"/>
-            <w:vAlign w:val="center"/>
-          </w:tcPr>
-          <w:p>
-            <w:pPr>
-              <w:spacing w:line="360" w:lineRule="exact"/>
-              <w:jc w:val="left"/>
-            </w:pPr>
-            <w:r/>
-            <w:r>
-              <w:rPr>
-                <w:rFonts w:ascii="Times New Roman" w:hAnsi="Times New Roman" w:eastAsia="宋体"/>
-                <w:b w:val="0"/>
-                <w:i w:val="0"/>
-                <w:sz w:val="21"/>
-              </w:rPr>
-              <w:t>Eval set development-pool</w:t>
+            <w:tcW w:type="dxa" w:w="3311"/>
+            <w:vAlign w:val="center"/>
+          </w:tcPr>
+          <w:p>
+            <w:pPr>
+              <w:spacing w:line="360" w:lineRule="exact"/>
+              <w:jc w:val="left"/>
+            </w:pPr>
+            <w:r/>
+            <w:r>
+              <w:rPr>
+                <w:rFonts w:ascii="Times New Roman" w:hAnsi="Times New Roman" w:eastAsia="宋体"/>
+                <w:b w:val="0"/>
+                <w:i w:val="0"/>
+                <w:sz w:val="21"/>
+              </w:rPr>
+              <w:t>DiariZen cached output</w:t>
+            </w:r>
+          </w:p>
+        </w:tc>
+        <w:tc>
+          <w:tcPr>
+            <w:tcW w:type="dxa" w:w="5903"/>
+            <w:vAlign w:val="center"/>
+          </w:tcPr>
+          <w:p>
+            <w:pPr>
+              <w:spacing w:line="360" w:lineRule="exact"/>
+              <w:jc w:val="left"/>
+            </w:pPr>
+            <w:r/>
+            <w:r>
+              <w:rPr>
+                <w:rFonts w:ascii="Times New Roman" w:hAnsi="Times New Roman" w:eastAsia="宋体"/>
+                <w:b w:val="0"/>
+                <w:i w:val="0"/>
+                <w:sz w:val="21"/>
+              </w:rPr>
+              <w:t>提供高质量慢速输出，是 slow-first 主路径。</w:t>
             </w:r>
           </w:p>
         </w:tc>
@@ -2142,45 +2418,45 @@
       <w:tr>
         <w:tc>
           <w:tcPr>
-            <w:tcW w:type="dxa" w:w="2880"/>
-            <w:vAlign w:val="center"/>
-          </w:tcPr>
-          <w:p>
-            <w:pPr>
-              <w:spacing w:line="360" w:lineRule="exact"/>
-              <w:jc w:val="left"/>
-            </w:pPr>
-            <w:r/>
-            <w:r>
-              <w:rPr>
-                <w:rFonts w:ascii="Times New Roman" w:hAnsi="Times New Roman" w:eastAsia="宋体"/>
-                <w:b w:val="0"/>
-                <w:i w:val="0"/>
-                <w:sz w:val="21"/>
-              </w:rPr>
-              <w:t>录音数量</w:t>
-            </w:r>
-          </w:p>
-        </w:tc>
-        <w:tc>
-          <w:tcPr>
-            <w:tcW w:type="dxa" w:w="6336"/>
-            <w:vAlign w:val="center"/>
-          </w:tcPr>
-          <w:p>
-            <w:pPr>
-              <w:spacing w:line="360" w:lineRule="exact"/>
-              <w:jc w:val="left"/>
-            </w:pPr>
-            <w:r/>
-            <w:r>
-              <w:rPr>
-                <w:rFonts w:ascii="Times New Roman" w:hAnsi="Times New Roman" w:eastAsia="宋体"/>
-                <w:b w:val="0"/>
-                <w:i w:val="0"/>
-                <w:sz w:val="21"/>
-              </w:rPr>
-              <w:t>8 条</w:t>
+            <w:tcW w:type="dxa" w:w="3311"/>
+            <w:vAlign w:val="center"/>
+          </w:tcPr>
+          <w:p>
+            <w:pPr>
+              <w:spacing w:line="360" w:lineRule="exact"/>
+              <w:jc w:val="left"/>
+            </w:pPr>
+            <w:r/>
+            <w:r>
+              <w:rPr>
+                <w:rFonts w:ascii="Times New Roman" w:hAnsi="Times New Roman" w:eastAsia="宋体"/>
+                <w:b w:val="0"/>
+                <w:i w:val="0"/>
+                <w:sz w:val="21"/>
+              </w:rPr>
+              <w:t>Selector evidence</w:t>
+            </w:r>
+          </w:p>
+        </w:tc>
+        <w:tc>
+          <w:tcPr>
+            <w:tcW w:type="dxa" w:w="5903"/>
+            <w:vAlign w:val="center"/>
+          </w:tcPr>
+          <w:p>
+            <w:pPr>
+              <w:spacing w:line="360" w:lineRule="exact"/>
+              <w:jc w:val="left"/>
+            </w:pPr>
+            <w:r/>
+            <w:r>
+              <w:rPr>
+                <w:rFonts w:ascii="Times New Roman" w:hAnsi="Times New Roman" w:eastAsia="宋体"/>
+                <w:b w:val="0"/>
+                <w:i w:val="0"/>
+                <w:sz w:val="21"/>
+              </w:rPr>
+              <w:t>为候选选择提供离线证据，避免直接用评测答案做事后挑选。</w:t>
             </w:r>
           </w:p>
         </w:tc>
@@ -2188,45 +2464,45 @@
       <w:tr>
         <w:tc>
           <w:tcPr>
-            <w:tcW w:type="dxa" w:w="2880"/>
-            <w:vAlign w:val="center"/>
-          </w:tcPr>
-          <w:p>
-            <w:pPr>
-              <w:spacing w:line="360" w:lineRule="exact"/>
-              <w:jc w:val="left"/>
-            </w:pPr>
-            <w:r/>
-            <w:r>
-              <w:rPr>
-                <w:rFonts w:ascii="Times New Roman" w:hAnsi="Times New Roman" w:eastAsia="宋体"/>
-                <w:b w:val="0"/>
-                <w:i w:val="0"/>
-                <w:sz w:val="21"/>
-              </w:rPr>
-              <w:t>评估窗口</w:t>
-            </w:r>
-          </w:p>
-        </w:tc>
-        <w:tc>
-          <w:tcPr>
-            <w:tcW w:type="dxa" w:w="6336"/>
-            <w:vAlign w:val="center"/>
-          </w:tcPr>
-          <w:p>
-            <w:pPr>
-              <w:spacing w:line="360" w:lineRule="exact"/>
-              <w:jc w:val="left"/>
-            </w:pPr>
-            <w:r/>
-            <w:r>
-              <w:rPr>
-                <w:rFonts w:ascii="Times New Roman" w:hAnsi="Times New Roman" w:eastAsia="宋体"/>
-                <w:b w:val="0"/>
-                <w:i w:val="0"/>
-                <w:sz w:val="21"/>
-              </w:rPr>
-              <w:t>120 个</w:t>
+            <w:tcW w:type="dxa" w:w="3311"/>
+            <w:vAlign w:val="center"/>
+          </w:tcPr>
+          <w:p>
+            <w:pPr>
+              <w:spacing w:line="360" w:lineRule="exact"/>
+              <w:jc w:val="left"/>
+            </w:pPr>
+            <w:r/>
+            <w:r>
+              <w:rPr>
+                <w:rFonts w:ascii="Times New Roman" w:hAnsi="Times New Roman" w:eastAsia="宋体"/>
+                <w:b w:val="0"/>
+                <w:i w:val="0"/>
+                <w:sz w:val="21"/>
+              </w:rPr>
+              <w:t>Rule-recover overlay</w:t>
+            </w:r>
+          </w:p>
+        </w:tc>
+        <w:tc>
+          <w:tcPr>
+            <w:tcW w:type="dxa" w:w="5903"/>
+            <w:vAlign w:val="center"/>
+          </w:tcPr>
+          <w:p>
+            <w:pPr>
+              <w:spacing w:line="360" w:lineRule="exact"/>
+              <w:jc w:val="left"/>
+            </w:pPr>
+            <w:r/>
+            <w:r>
+              <w:rPr>
+                <w:rFonts w:ascii="Times New Roman" w:hAnsi="Times New Roman" w:eastAsia="宋体"/>
+                <w:b w:val="0"/>
+                <w:i w:val="0"/>
+                <w:sz w:val="21"/>
+              </w:rPr>
+              <w:t>对少量高置信可恢复片段进行稀疏修正。</w:t>
             </w:r>
           </w:p>
         </w:tc>
@@ -2234,45 +2510,45 @@
       <w:tr>
         <w:tc>
           <w:tcPr>
-            <w:tcW w:type="dxa" w:w="2880"/>
-            <w:vAlign w:val="center"/>
-          </w:tcPr>
-          <w:p>
-            <w:pPr>
-              <w:spacing w:line="360" w:lineRule="exact"/>
-              <w:jc w:val="left"/>
-            </w:pPr>
-            <w:r/>
-            <w:r>
-              <w:rPr>
-                <w:rFonts w:ascii="Times New Roman" w:hAnsi="Times New Roman" w:eastAsia="宋体"/>
-                <w:b w:val="0"/>
-                <w:i w:val="0"/>
-                <w:sz w:val="21"/>
-              </w:rPr>
-              <w:t>窗口大小</w:t>
-            </w:r>
-          </w:p>
-        </w:tc>
-        <w:tc>
-          <w:tcPr>
-            <w:tcW w:type="dxa" w:w="6336"/>
-            <w:vAlign w:val="center"/>
-          </w:tcPr>
-          <w:p>
-            <w:pPr>
-              <w:spacing w:line="360" w:lineRule="exact"/>
-              <w:jc w:val="left"/>
-            </w:pPr>
-            <w:r/>
-            <w:r>
-              <w:rPr>
-                <w:rFonts w:ascii="Times New Roman" w:hAnsi="Times New Roman" w:eastAsia="宋体"/>
-                <w:b w:val="0"/>
-                <w:i w:val="0"/>
-                <w:sz w:val="21"/>
-              </w:rPr>
-              <w:t>30 秒</w:t>
+            <w:tcW w:type="dxa" w:w="3311"/>
+            <w:vAlign w:val="center"/>
+          </w:tcPr>
+          <w:p>
+            <w:pPr>
+              <w:spacing w:line="360" w:lineRule="exact"/>
+              <w:jc w:val="left"/>
+            </w:pPr>
+            <w:r/>
+            <w:r>
+              <w:rPr>
+                <w:rFonts w:ascii="Times New Roman" w:hAnsi="Times New Roman" w:eastAsia="宋体"/>
+                <w:b w:val="0"/>
+                <w:i w:val="0"/>
+                <w:sz w:val="21"/>
+              </w:rPr>
+              <w:t>Guard/quarantine gate</w:t>
+            </w:r>
+          </w:p>
+        </w:tc>
+        <w:tc>
+          <w:tcPr>
+            <w:tcW w:type="dxa" w:w="5903"/>
+            <w:vAlign w:val="center"/>
+          </w:tcPr>
+          <w:p>
+            <w:pPr>
+              <w:spacing w:line="360" w:lineRule="exact"/>
+              <w:jc w:val="left"/>
+            </w:pPr>
+            <w:r/>
+            <w:r>
+              <w:rPr>
+                <w:rFonts w:ascii="Times New Roman" w:hAnsi="Times New Roman" w:eastAsia="宋体"/>
+                <w:b w:val="0"/>
+                <w:i w:val="0"/>
+                <w:sz w:val="21"/>
+              </w:rPr>
+              <w:t>阻止缺少证据或可能破坏 timeline 的有害修改。</w:t>
             </w:r>
           </w:p>
         </w:tc>
@@ -2280,137 +2556,45 @@
       <w:tr>
         <w:tc>
           <w:tcPr>
-            <w:tcW w:type="dxa" w:w="2880"/>
-            <w:vAlign w:val="center"/>
-          </w:tcPr>
-          <w:p>
-            <w:pPr>
-              <w:spacing w:line="360" w:lineRule="exact"/>
-              <w:jc w:val="left"/>
-            </w:pPr>
-            <w:r/>
-            <w:r>
-              <w:rPr>
-                <w:rFonts w:ascii="Times New Roman" w:hAnsi="Times New Roman" w:eastAsia="宋体"/>
-                <w:b w:val="0"/>
-                <w:i w:val="0"/>
-                <w:sz w:val="21"/>
-              </w:rPr>
-              <w:t>评估音频总量</w:t>
-            </w:r>
-          </w:p>
-        </w:tc>
-        <w:tc>
-          <w:tcPr>
-            <w:tcW w:type="dxa" w:w="6336"/>
-            <w:vAlign w:val="center"/>
-          </w:tcPr>
-          <w:p>
-            <w:pPr>
-              <w:spacing w:line="360" w:lineRule="exact"/>
-              <w:jc w:val="left"/>
-            </w:pPr>
-            <w:r/>
-            <w:r>
-              <w:rPr>
-                <w:rFonts w:ascii="Times New Roman" w:hAnsi="Times New Roman" w:eastAsia="宋体"/>
-                <w:b w:val="0"/>
-                <w:i w:val="0"/>
-                <w:sz w:val="21"/>
-              </w:rPr>
-              <w:t>3600.0 秒</w:t>
-            </w:r>
-          </w:p>
-        </w:tc>
-      </w:tr>
-      <w:tr>
-        <w:tc>
-          <w:tcPr>
-            <w:tcW w:type="dxa" w:w="2880"/>
-            <w:vAlign w:val="center"/>
-          </w:tcPr>
-          <w:p>
-            <w:pPr>
-              <w:spacing w:line="360" w:lineRule="exact"/>
-              <w:jc w:val="left"/>
-            </w:pPr>
-            <w:r/>
-            <w:r>
-              <w:rPr>
-                <w:rFonts w:ascii="Times New Roman" w:hAnsi="Times New Roman" w:eastAsia="宋体"/>
-                <w:b w:val="0"/>
-                <w:i w:val="0"/>
-                <w:sz w:val="21"/>
-              </w:rPr>
-              <w:t>主指标</w:t>
-            </w:r>
-          </w:p>
-        </w:tc>
-        <w:tc>
-          <w:tcPr>
-            <w:tcW w:type="dxa" w:w="6336"/>
-            <w:vAlign w:val="center"/>
-          </w:tcPr>
-          <w:p>
-            <w:pPr>
-              <w:spacing w:line="360" w:lineRule="exact"/>
-              <w:jc w:val="left"/>
-            </w:pPr>
-            <w:r/>
-            <w:r>
-              <w:rPr>
-                <w:rFonts w:ascii="Times New Roman" w:hAnsi="Times New Roman" w:eastAsia="宋体"/>
-                <w:b w:val="0"/>
-                <w:i w:val="0"/>
-                <w:sz w:val="21"/>
-              </w:rPr>
-              <w:t>DER</w:t>
-            </w:r>
-          </w:p>
-        </w:tc>
-      </w:tr>
-      <w:tr>
-        <w:tc>
-          <w:tcPr>
-            <w:tcW w:type="dxa" w:w="2880"/>
-            <w:vAlign w:val="center"/>
-          </w:tcPr>
-          <w:p>
-            <w:pPr>
-              <w:spacing w:line="360" w:lineRule="exact"/>
-              <w:jc w:val="left"/>
-            </w:pPr>
-            <w:r/>
-            <w:r>
-              <w:rPr>
-                <w:rFonts w:ascii="Times New Roman" w:hAnsi="Times New Roman" w:eastAsia="宋体"/>
-                <w:b w:val="0"/>
-                <w:i w:val="0"/>
-                <w:sz w:val="21"/>
-              </w:rPr>
-              <w:t>默认在线 API 调用</w:t>
-            </w:r>
-          </w:p>
-        </w:tc>
-        <w:tc>
-          <w:tcPr>
-            <w:tcW w:type="dxa" w:w="6336"/>
-            <w:vAlign w:val="center"/>
-          </w:tcPr>
-          <w:p>
-            <w:pPr>
-              <w:spacing w:line="360" w:lineRule="exact"/>
-              <w:jc w:val="left"/>
-            </w:pPr>
-            <w:r/>
-            <w:r>
-              <w:rPr>
-                <w:rFonts w:ascii="Times New Roman" w:hAnsi="Times New Roman" w:eastAsia="宋体"/>
-                <w:b w:val="0"/>
-                <w:i w:val="0"/>
-                <w:sz w:val="21"/>
-              </w:rPr>
-              <w:t>0</w:t>
+            <w:tcW w:type="dxa" w:w="3311"/>
+            <w:vAlign w:val="center"/>
+          </w:tcPr>
+          <w:p>
+            <w:pPr>
+              <w:spacing w:line="360" w:lineRule="exact"/>
+              <w:jc w:val="left"/>
+            </w:pPr>
+            <w:r/>
+            <w:r>
+              <w:rPr>
+                <w:rFonts w:ascii="Times New Roman" w:hAnsi="Times New Roman" w:eastAsia="宋体"/>
+                <w:b w:val="0"/>
+                <w:i w:val="0"/>
+                <w:sz w:val="21"/>
+              </w:rPr>
+              <w:t>Regression/self-check</w:t>
+            </w:r>
+          </w:p>
+        </w:tc>
+        <w:tc>
+          <w:tcPr>
+            <w:tcW w:type="dxa" w:w="5903"/>
+            <w:vAlign w:val="center"/>
+          </w:tcPr>
+          <w:p>
+            <w:pPr>
+              <w:spacing w:line="360" w:lineRule="exact"/>
+              <w:jc w:val="left"/>
+            </w:pPr>
+            <w:r/>
+            <w:r>
+              <w:rPr>
+                <w:rFonts w:ascii="Times New Roman" w:hAnsi="Times New Roman" w:eastAsia="宋体"/>
+                <w:b w:val="0"/>
+                <w:i w:val="0"/>
+                <w:sz w:val="21"/>
+              </w:rPr>
+              <w:t>验证最终系统、指标、缓存和交付路径是否一致。</w:t>
             </w:r>
           </w:p>
         </w:tc>
@@ -2425,18 +2609,133 @@
     </w:p>
     <w:p>
       <w:pPr>
-        <w:spacing w:line="360" w:lineRule="exact" w:before="0" w:after="0"/>
-        <w:ind w:firstLine="420"/>
-        <w:jc w:val="both"/>
-      </w:pPr>
-      <w:r>
-        <w:rPr>
-          <w:rFonts w:ascii="Times New Roman" w:hAnsi="Times New Roman" w:eastAsia="宋体"/>
-          <w:b w:val="0"/>
-          <w:i w:val="0"/>
-          <w:sz w:val="21"/>
-        </w:rPr>
-        <w:t>最终系统与基线模型的性能对比如下表所示。</w:t>
+        <w:pStyle w:val="3"/>
+        <w:spacing w:line="360" w:lineRule="exact" w:before="180" w:after="180"/>
+        <w:ind w:firstLine="420"/>
+        <w:jc w:val="left"/>
+      </w:pPr>
+      <w:r>
+        <w:rPr>
+          <w:rFonts w:ascii="Times New Roman" w:hAnsi="Times New Roman" w:eastAsia="黑体"/>
+          <w:b/>
+          <w:i w:val="0"/>
+          <w:sz w:val="21"/>
+        </w:rPr>
+        <w:t>4.3 代码结构与工程实现</w:t>
+      </w:r>
+    </w:p>
+    <w:p>
+      <w:pPr>
+        <w:spacing w:line="360" w:lineRule="exact" w:before="0" w:after="0"/>
+        <w:ind w:firstLine="420"/>
+        <w:jc w:val="both"/>
+      </w:pPr>
+      <w:r>
+        <w:rPr>
+          <w:rFonts w:ascii="Times New Roman" w:hAnsi="Times New Roman" w:eastAsia="宋体"/>
+          <w:b w:val="0"/>
+          <w:i w:val="0"/>
+          <w:sz w:val="21"/>
+        </w:rPr>
+        <w:t>最终交付版本已整理为 Python package，而不是散落脚本。核心目录包括 alimeeting_diarization_bench/run.py、alimeeting_diarization_bench/cli.py、alimeeting_diarization_bench/final/、models/、evaluation/ 和 metrics/。其中 final/ 目录保存 quick start、realtime runtime、batch、regression、自检、timeline integrity、baseline audit 和 promotion gate 等模块。</w:t>
+      </w:r>
+    </w:p>
+    <w:p>
+      <w:pPr>
+        <w:spacing w:line="360" w:lineRule="exact" w:before="0" w:after="0"/>
+        <w:ind w:firstLine="420"/>
+        <w:jc w:val="both"/>
+      </w:pPr>
+      <w:r>
+        <w:rPr>
+          <w:rFonts w:ascii="Times New Roman" w:hAnsi="Times New Roman" w:eastAsia="宋体"/>
+          <w:b w:val="0"/>
+          <w:i w:val="0"/>
+          <w:sz w:val="21"/>
+        </w:rPr>
+        <w:t>安装项目后，用户可以直接使用 alimeeting-quick-start、alimeeting-realtime、alimeeting-batch、alimeeting-regression、alimeeting-self-check 和 alimeeting-timeline-check 等命令。这样的组织方式使项目从“实验脚本集合”转变为“可安装、可运行、可验证”的交付包。</w:t>
+      </w:r>
+    </w:p>
+    <w:p>
+      <w:pPr>
+        <w:pStyle w:val="3"/>
+        <w:spacing w:line="360" w:lineRule="exact" w:before="180" w:after="180"/>
+        <w:ind w:firstLine="420"/>
+        <w:jc w:val="left"/>
+      </w:pPr>
+      <w:r>
+        <w:rPr>
+          <w:rFonts w:ascii="Times New Roman" w:hAnsi="Times New Roman" w:eastAsia="黑体"/>
+          <w:b/>
+          <w:i w:val="0"/>
+          <w:sz w:val="21"/>
+        </w:rPr>
+        <w:t>4.4 可复现与安全边界</w:t>
+      </w:r>
+    </w:p>
+    <w:p>
+      <w:pPr>
+        <w:spacing w:line="360" w:lineRule="exact" w:before="0" w:after="0"/>
+        <w:ind w:firstLine="420"/>
+        <w:jc w:val="both"/>
+      </w:pPr>
+      <w:r>
+        <w:rPr>
+          <w:rFonts w:ascii="Times New Roman" w:hAnsi="Times New Roman" w:eastAsia="宋体"/>
+          <w:b w:val="0"/>
+          <w:i w:val="0"/>
+          <w:sz w:val="21"/>
+        </w:rPr>
+        <w:t>默认交付路径使用 cached outputs 和 frozen artifacts，live API calls 为 0。这意味着复现者不需要在线调用 DeepSeek、Qwen、Omni 或 GPT，也不会因为 API 版本变化导致结果漂移。对于课程交付而言，这一点非常重要，因为评审环境可能没有外部 API key，也可能无法复现在线模型当时的状态。</w:t>
+      </w:r>
+    </w:p>
+    <w:p>
+      <w:pPr>
+        <w:spacing w:line="360" w:lineRule="exact" w:before="0" w:after="0"/>
+        <w:ind w:firstLine="420"/>
+        <w:jc w:val="both"/>
+      </w:pPr>
+      <w:r>
+        <w:rPr>
+          <w:rFonts w:ascii="Times New Roman" w:hAnsi="Times New Roman" w:eastAsia="宋体"/>
+          <w:b w:val="0"/>
+          <w:i w:val="0"/>
+          <w:sz w:val="21"/>
+        </w:rPr>
+        <w:t>同时，项目没有把 development-pool 结果夸大为最终泛化结论。README、技术报告和本文均明确说明当前结果仍需 sealed true-heldout split 验证，selector robustness 与 recording-level stability 也是后续提升方向。这种边界说明有助于保持结果表述严谨。</w:t>
+      </w:r>
+    </w:p>
+    <w:p>
+      <w:pPr>
+        <w:pStyle w:val="2"/>
+        <w:spacing w:line="360" w:lineRule="exact" w:before="180" w:after="180"/>
+        <w:ind w:firstLine="0"/>
+        <w:jc w:val="left"/>
+      </w:pPr>
+      <w:r>
+        <w:rPr>
+          <w:rFonts w:ascii="Times New Roman" w:hAnsi="Times New Roman" w:eastAsia="黑体"/>
+          <w:b/>
+          <w:i w:val="0"/>
+          <w:sz w:val="21"/>
+        </w:rPr>
+        <w:t>5 仿真结果（包括性能指标）</w:t>
+      </w:r>
+    </w:p>
+    <w:p>
+      <w:pPr>
+        <w:spacing w:line="360" w:lineRule="exact" w:before="0" w:after="0"/>
+        <w:ind w:firstLine="420"/>
+        <w:jc w:val="both"/>
+      </w:pPr>
+      <w:r>
+        <w:rPr>
+          <w:rFonts w:ascii="Times New Roman" w:hAnsi="Times New Roman" w:eastAsia="宋体"/>
+          <w:b w:val="0"/>
+          <w:i w:val="0"/>
+          <w:sz w:val="21"/>
+        </w:rPr>
+        <w:t>本课题使用 frozen cached outputs 与 frozen artifacts 进行离线 replay。这样做的目的不是规避模型推理，而是保证课程交付版本在不同机器上可以稳定复现同一组结果。核心实验配置如下表所示。</w:t>
       </w:r>
     </w:p>
     <w:tbl>
@@ -2451,6 +2750,455 @@
       <w:tr>
         <w:tc>
           <w:tcPr>
+            <w:tcW w:type="dxa" w:w="2880"/>
+            <w:shd w:fill="EDEDED"/>
+            <w:vAlign w:val="center"/>
+          </w:tcPr>
+          <w:p>
+            <w:pPr>
+              <w:spacing w:line="360" w:lineRule="exact"/>
+              <w:jc w:val="center"/>
+            </w:pPr>
+            <w:r/>
+            <w:r>
+              <w:rPr>
+                <w:rFonts w:ascii="Times New Roman" w:hAnsi="Times New Roman" w:eastAsia="宋体"/>
+                <w:b/>
+                <w:i w:val="0"/>
+                <w:sz w:val="21"/>
+              </w:rPr>
+              <w:t>项目</w:t>
+            </w:r>
+          </w:p>
+        </w:tc>
+        <w:tc>
+          <w:tcPr>
+            <w:tcW w:type="dxa" w:w="6336"/>
+            <w:shd w:fill="EDEDED"/>
+            <w:vAlign w:val="center"/>
+          </w:tcPr>
+          <w:p>
+            <w:pPr>
+              <w:spacing w:line="360" w:lineRule="exact"/>
+              <w:jc w:val="center"/>
+            </w:pPr>
+            <w:r/>
+            <w:r>
+              <w:rPr>
+                <w:rFonts w:ascii="Times New Roman" w:hAnsi="Times New Roman" w:eastAsia="宋体"/>
+                <w:b/>
+                <w:i w:val="0"/>
+                <w:sz w:val="21"/>
+              </w:rPr>
+              <w:t>设置</w:t>
+            </w:r>
+          </w:p>
+        </w:tc>
+      </w:tr>
+      <w:tr>
+        <w:tc>
+          <w:tcPr>
+            <w:tcW w:type="dxa" w:w="2880"/>
+            <w:vAlign w:val="center"/>
+          </w:tcPr>
+          <w:p>
+            <w:pPr>
+              <w:spacing w:line="360" w:lineRule="exact"/>
+              <w:jc w:val="left"/>
+            </w:pPr>
+            <w:r/>
+            <w:r>
+              <w:rPr>
+                <w:rFonts w:ascii="Times New Roman" w:hAnsi="Times New Roman" w:eastAsia="宋体"/>
+                <w:b w:val="0"/>
+                <w:i w:val="0"/>
+                <w:sz w:val="21"/>
+              </w:rPr>
+              <w:t>数据集</w:t>
+            </w:r>
+          </w:p>
+        </w:tc>
+        <w:tc>
+          <w:tcPr>
+            <w:tcW w:type="dxa" w:w="6336"/>
+            <w:vAlign w:val="center"/>
+          </w:tcPr>
+          <w:p>
+            <w:pPr>
+              <w:spacing w:line="360" w:lineRule="exact"/>
+              <w:jc w:val="left"/>
+            </w:pPr>
+            <w:r/>
+            <w:r>
+              <w:rPr>
+                <w:rFonts w:ascii="Times New Roman" w:hAnsi="Times New Roman" w:eastAsia="宋体"/>
+                <w:b w:val="0"/>
+                <w:i w:val="0"/>
+                <w:sz w:val="21"/>
+              </w:rPr>
+              <w:t>AliMeeting</w:t>
+            </w:r>
+          </w:p>
+        </w:tc>
+      </w:tr>
+      <w:tr>
+        <w:tc>
+          <w:tcPr>
+            <w:tcW w:type="dxa" w:w="2880"/>
+            <w:vAlign w:val="center"/>
+          </w:tcPr>
+          <w:p>
+            <w:pPr>
+              <w:spacing w:line="360" w:lineRule="exact"/>
+              <w:jc w:val="left"/>
+            </w:pPr>
+            <w:r/>
+            <w:r>
+              <w:rPr>
+                <w:rFonts w:ascii="Times New Roman" w:hAnsi="Times New Roman" w:eastAsia="宋体"/>
+                <w:b w:val="0"/>
+                <w:i w:val="0"/>
+                <w:sz w:val="21"/>
+              </w:rPr>
+              <w:t>使用划分</w:t>
+            </w:r>
+          </w:p>
+        </w:tc>
+        <w:tc>
+          <w:tcPr>
+            <w:tcW w:type="dxa" w:w="6336"/>
+            <w:vAlign w:val="center"/>
+          </w:tcPr>
+          <w:p>
+            <w:pPr>
+              <w:spacing w:line="360" w:lineRule="exact"/>
+              <w:jc w:val="left"/>
+            </w:pPr>
+            <w:r/>
+            <w:r>
+              <w:rPr>
+                <w:rFonts w:ascii="Times New Roman" w:hAnsi="Times New Roman" w:eastAsia="宋体"/>
+                <w:b w:val="0"/>
+                <w:i w:val="0"/>
+                <w:sz w:val="21"/>
+              </w:rPr>
+              <w:t>Eval set development-pool</w:t>
+            </w:r>
+          </w:p>
+        </w:tc>
+      </w:tr>
+      <w:tr>
+        <w:tc>
+          <w:tcPr>
+            <w:tcW w:type="dxa" w:w="2880"/>
+            <w:vAlign w:val="center"/>
+          </w:tcPr>
+          <w:p>
+            <w:pPr>
+              <w:spacing w:line="360" w:lineRule="exact"/>
+              <w:jc w:val="left"/>
+            </w:pPr>
+            <w:r/>
+            <w:r>
+              <w:rPr>
+                <w:rFonts w:ascii="Times New Roman" w:hAnsi="Times New Roman" w:eastAsia="宋体"/>
+                <w:b w:val="0"/>
+                <w:i w:val="0"/>
+                <w:sz w:val="21"/>
+              </w:rPr>
+              <w:t>录音数量</w:t>
+            </w:r>
+          </w:p>
+        </w:tc>
+        <w:tc>
+          <w:tcPr>
+            <w:tcW w:type="dxa" w:w="6336"/>
+            <w:vAlign w:val="center"/>
+          </w:tcPr>
+          <w:p>
+            <w:pPr>
+              <w:spacing w:line="360" w:lineRule="exact"/>
+              <w:jc w:val="left"/>
+            </w:pPr>
+            <w:r/>
+            <w:r>
+              <w:rPr>
+                <w:rFonts w:ascii="Times New Roman" w:hAnsi="Times New Roman" w:eastAsia="宋体"/>
+                <w:b w:val="0"/>
+                <w:i w:val="0"/>
+                <w:sz w:val="21"/>
+              </w:rPr>
+              <w:t>8 条</w:t>
+            </w:r>
+          </w:p>
+        </w:tc>
+      </w:tr>
+      <w:tr>
+        <w:tc>
+          <w:tcPr>
+            <w:tcW w:type="dxa" w:w="2880"/>
+            <w:vAlign w:val="center"/>
+          </w:tcPr>
+          <w:p>
+            <w:pPr>
+              <w:spacing w:line="360" w:lineRule="exact"/>
+              <w:jc w:val="left"/>
+            </w:pPr>
+            <w:r/>
+            <w:r>
+              <w:rPr>
+                <w:rFonts w:ascii="Times New Roman" w:hAnsi="Times New Roman" w:eastAsia="宋体"/>
+                <w:b w:val="0"/>
+                <w:i w:val="0"/>
+                <w:sz w:val="21"/>
+              </w:rPr>
+              <w:t>评估窗口</w:t>
+            </w:r>
+          </w:p>
+        </w:tc>
+        <w:tc>
+          <w:tcPr>
+            <w:tcW w:type="dxa" w:w="6336"/>
+            <w:vAlign w:val="center"/>
+          </w:tcPr>
+          <w:p>
+            <w:pPr>
+              <w:spacing w:line="360" w:lineRule="exact"/>
+              <w:jc w:val="left"/>
+            </w:pPr>
+            <w:r/>
+            <w:r>
+              <w:rPr>
+                <w:rFonts w:ascii="Times New Roman" w:hAnsi="Times New Roman" w:eastAsia="宋体"/>
+                <w:b w:val="0"/>
+                <w:i w:val="0"/>
+                <w:sz w:val="21"/>
+              </w:rPr>
+              <w:t>120 个</w:t>
+            </w:r>
+          </w:p>
+        </w:tc>
+      </w:tr>
+      <w:tr>
+        <w:tc>
+          <w:tcPr>
+            <w:tcW w:type="dxa" w:w="2880"/>
+            <w:vAlign w:val="center"/>
+          </w:tcPr>
+          <w:p>
+            <w:pPr>
+              <w:spacing w:line="360" w:lineRule="exact"/>
+              <w:jc w:val="left"/>
+            </w:pPr>
+            <w:r/>
+            <w:r>
+              <w:rPr>
+                <w:rFonts w:ascii="Times New Roman" w:hAnsi="Times New Roman" w:eastAsia="宋体"/>
+                <w:b w:val="0"/>
+                <w:i w:val="0"/>
+                <w:sz w:val="21"/>
+              </w:rPr>
+              <w:t>窗口大小</w:t>
+            </w:r>
+          </w:p>
+        </w:tc>
+        <w:tc>
+          <w:tcPr>
+            <w:tcW w:type="dxa" w:w="6336"/>
+            <w:vAlign w:val="center"/>
+          </w:tcPr>
+          <w:p>
+            <w:pPr>
+              <w:spacing w:line="360" w:lineRule="exact"/>
+              <w:jc w:val="left"/>
+            </w:pPr>
+            <w:r/>
+            <w:r>
+              <w:rPr>
+                <w:rFonts w:ascii="Times New Roman" w:hAnsi="Times New Roman" w:eastAsia="宋体"/>
+                <w:b w:val="0"/>
+                <w:i w:val="0"/>
+                <w:sz w:val="21"/>
+              </w:rPr>
+              <w:t>30 秒</w:t>
+            </w:r>
+          </w:p>
+        </w:tc>
+      </w:tr>
+      <w:tr>
+        <w:tc>
+          <w:tcPr>
+            <w:tcW w:type="dxa" w:w="2880"/>
+            <w:vAlign w:val="center"/>
+          </w:tcPr>
+          <w:p>
+            <w:pPr>
+              <w:spacing w:line="360" w:lineRule="exact"/>
+              <w:jc w:val="left"/>
+            </w:pPr>
+            <w:r/>
+            <w:r>
+              <w:rPr>
+                <w:rFonts w:ascii="Times New Roman" w:hAnsi="Times New Roman" w:eastAsia="宋体"/>
+                <w:b w:val="0"/>
+                <w:i w:val="0"/>
+                <w:sz w:val="21"/>
+              </w:rPr>
+              <w:t>评估音频总量</w:t>
+            </w:r>
+          </w:p>
+        </w:tc>
+        <w:tc>
+          <w:tcPr>
+            <w:tcW w:type="dxa" w:w="6336"/>
+            <w:vAlign w:val="center"/>
+          </w:tcPr>
+          <w:p>
+            <w:pPr>
+              <w:spacing w:line="360" w:lineRule="exact"/>
+              <w:jc w:val="left"/>
+            </w:pPr>
+            <w:r/>
+            <w:r>
+              <w:rPr>
+                <w:rFonts w:ascii="Times New Roman" w:hAnsi="Times New Roman" w:eastAsia="宋体"/>
+                <w:b w:val="0"/>
+                <w:i w:val="0"/>
+                <w:sz w:val="21"/>
+              </w:rPr>
+              <w:t>3600.0 秒</w:t>
+            </w:r>
+          </w:p>
+        </w:tc>
+      </w:tr>
+      <w:tr>
+        <w:tc>
+          <w:tcPr>
+            <w:tcW w:type="dxa" w:w="2880"/>
+            <w:vAlign w:val="center"/>
+          </w:tcPr>
+          <w:p>
+            <w:pPr>
+              <w:spacing w:line="360" w:lineRule="exact"/>
+              <w:jc w:val="left"/>
+            </w:pPr>
+            <w:r/>
+            <w:r>
+              <w:rPr>
+                <w:rFonts w:ascii="Times New Roman" w:hAnsi="Times New Roman" w:eastAsia="宋体"/>
+                <w:b w:val="0"/>
+                <w:i w:val="0"/>
+                <w:sz w:val="21"/>
+              </w:rPr>
+              <w:t>主指标</w:t>
+            </w:r>
+          </w:p>
+        </w:tc>
+        <w:tc>
+          <w:tcPr>
+            <w:tcW w:type="dxa" w:w="6336"/>
+            <w:vAlign w:val="center"/>
+          </w:tcPr>
+          <w:p>
+            <w:pPr>
+              <w:spacing w:line="360" w:lineRule="exact"/>
+              <w:jc w:val="left"/>
+            </w:pPr>
+            <w:r/>
+            <w:r>
+              <w:rPr>
+                <w:rFonts w:ascii="Times New Roman" w:hAnsi="Times New Roman" w:eastAsia="宋体"/>
+                <w:b w:val="0"/>
+                <w:i w:val="0"/>
+                <w:sz w:val="21"/>
+              </w:rPr>
+              <w:t>DER</w:t>
+            </w:r>
+          </w:p>
+        </w:tc>
+      </w:tr>
+      <w:tr>
+        <w:tc>
+          <w:tcPr>
+            <w:tcW w:type="dxa" w:w="2880"/>
+            <w:vAlign w:val="center"/>
+          </w:tcPr>
+          <w:p>
+            <w:pPr>
+              <w:spacing w:line="360" w:lineRule="exact"/>
+              <w:jc w:val="left"/>
+            </w:pPr>
+            <w:r/>
+            <w:r>
+              <w:rPr>
+                <w:rFonts w:ascii="Times New Roman" w:hAnsi="Times New Roman" w:eastAsia="宋体"/>
+                <w:b w:val="0"/>
+                <w:i w:val="0"/>
+                <w:sz w:val="21"/>
+              </w:rPr>
+              <w:t>默认在线 API 调用</w:t>
+            </w:r>
+          </w:p>
+        </w:tc>
+        <w:tc>
+          <w:tcPr>
+            <w:tcW w:type="dxa" w:w="6336"/>
+            <w:vAlign w:val="center"/>
+          </w:tcPr>
+          <w:p>
+            <w:pPr>
+              <w:spacing w:line="360" w:lineRule="exact"/>
+              <w:jc w:val="left"/>
+            </w:pPr>
+            <w:r/>
+            <w:r>
+              <w:rPr>
+                <w:rFonts w:ascii="Times New Roman" w:hAnsi="Times New Roman" w:eastAsia="宋体"/>
+                <w:b w:val="0"/>
+                <w:i w:val="0"/>
+                <w:sz w:val="21"/>
+              </w:rPr>
+              <w:t>0</w:t>
+            </w:r>
+          </w:p>
+        </w:tc>
+      </w:tr>
+    </w:tbl>
+    <w:p>
+      <w:pPr>
+        <w:spacing w:line="360" w:lineRule="exact" w:before="0" w:after="0"/>
+        <w:ind w:firstLine="0"/>
+        <w:jc w:val="both"/>
+      </w:pPr>
+    </w:p>
+    <w:p>
+      <w:pPr>
+        <w:spacing w:line="360" w:lineRule="exact" w:before="0" w:after="0"/>
+        <w:ind w:firstLine="420"/>
+        <w:jc w:val="both"/>
+      </w:pPr>
+      <w:r>
+        <w:rPr>
+          <w:rFonts w:ascii="Times New Roman" w:hAnsi="Times New Roman" w:eastAsia="宋体"/>
+          <w:b w:val="0"/>
+          <w:i w:val="0"/>
+          <w:sz w:val="21"/>
+        </w:rPr>
+        <w:t>最终系统与基线模型的性能对比如下表所示。</w:t>
+      </w:r>
+    </w:p>
+    <w:tbl>
+      <w:tblPr>
+        <w:tblW w:type="auto" w:w="0"/>
+        <w:tblLook w:firstColumn="1" w:firstRow="1" w:lastColumn="0" w:lastRow="0" w:noHBand="0" w:noVBand="1" w:val="04A0"/>
+      </w:tblPr>
+      <w:tblGrid>
+        <w:gridCol w:w="4513"/>
+        <w:gridCol w:w="4513"/>
+      </w:tblGrid>
+      <w:tr>
+        <w:tc>
+          <w:tcPr>
             <w:tcW w:type="dxa" w:w="4896"/>
             <w:shd w:fill="EDEDED"/>
             <w:vAlign w:val="center"/>
@@ -3055,6 +3803,567 @@
         <w:ind w:firstLine="0"/>
         <w:jc w:val="both"/>
       </w:pPr>
+    </w:p>
+    <w:p>
+      <w:pPr>
+        <w:spacing w:line="360" w:lineRule="exact" w:before="0" w:after="0"/>
+        <w:ind w:firstLine="420"/>
+        <w:jc w:val="both"/>
+      </w:pPr>
+      <w:r>
+        <w:rPr>
+          <w:rFonts w:ascii="Times New Roman" w:hAnsi="Times New Roman" w:eastAsia="宋体"/>
+          <w:b w:val="0"/>
+          <w:i w:val="0"/>
+          <w:sz w:val="21"/>
+        </w:rPr>
+        <w:t>从表中可以看出，最终系统相对于 fast baseline 的提升非常明显，说明在复杂会议语音场景中，单纯依赖快速模型难以满足高质量说话人分离需求。相对于 slow baseline，最终系统的提升幅度为 0.3886 个百分点，绝对数值较小，但考虑到 slow baseline 已经达到 16.8809% DER，该提升体现了在强基线之上继续优化的难度和价值。</w:t>
+      </w:r>
+    </w:p>
+    <w:p>
+      <w:pPr>
+        <w:spacing w:line="360" w:lineRule="exact" w:before="0" w:after="0"/>
+        <w:ind w:firstLine="420"/>
+        <w:jc w:val="both"/>
+      </w:pPr>
+      <w:r>
+        <w:rPr>
+          <w:rFonts w:ascii="Times New Roman" w:hAnsi="Times New Roman" w:eastAsia="宋体"/>
+          <w:b w:val="0"/>
+          <w:i w:val="0"/>
+          <w:sz w:val="21"/>
+        </w:rPr>
+        <w:t>为了更清晰地呈现最终系统与 baseline 的区别，下表从输入、决策方式、风险控制和复现方式四个方面进行对比。</w:t>
+      </w:r>
+    </w:p>
+    <w:tbl>
+      <w:tblPr>
+        <w:tblW w:type="auto" w:w="0"/>
+        <w:tblLook w:firstColumn="1" w:firstRow="1" w:lastColumn="0" w:lastRow="0" w:noHBand="0" w:noVBand="1" w:val="04A0"/>
+      </w:tblPr>
+      <w:tblGrid>
+        <w:gridCol w:w="3009"/>
+        <w:gridCol w:w="3009"/>
+        <w:gridCol w:w="3009"/>
+      </w:tblGrid>
+      <w:tr>
+        <w:tc>
+          <w:tcPr>
+            <w:tcW w:type="dxa" w:w="2160"/>
+            <w:shd w:fill="EDEDED"/>
+            <w:vAlign w:val="center"/>
+          </w:tcPr>
+          <w:p>
+            <w:pPr>
+              <w:spacing w:line="360" w:lineRule="exact"/>
+              <w:jc w:val="center"/>
+            </w:pPr>
+            <w:r/>
+            <w:r>
+              <w:rPr>
+                <w:rFonts w:ascii="Times New Roman" w:hAnsi="Times New Roman" w:eastAsia="宋体"/>
+                <w:b/>
+                <w:i w:val="0"/>
+                <w:sz w:val="21"/>
+              </w:rPr>
+              <w:t>比较维度</w:t>
+            </w:r>
+          </w:p>
+        </w:tc>
+        <w:tc>
+          <w:tcPr>
+            <w:tcW w:type="dxa" w:w="3600"/>
+            <w:shd w:fill="EDEDED"/>
+            <w:vAlign w:val="center"/>
+          </w:tcPr>
+          <w:p>
+            <w:pPr>
+              <w:spacing w:line="360" w:lineRule="exact"/>
+              <w:jc w:val="center"/>
+            </w:pPr>
+            <w:r/>
+            <w:r>
+              <w:rPr>
+                <w:rFonts w:ascii="Times New Roman" w:hAnsi="Times New Roman" w:eastAsia="宋体"/>
+                <w:b/>
+                <w:i w:val="0"/>
+                <w:sz w:val="21"/>
+              </w:rPr>
+              <w:t>Baseline</w:t>
+            </w:r>
+          </w:p>
+        </w:tc>
+        <w:tc>
+          <w:tcPr>
+            <w:tcW w:type="dxa" w:w="3888"/>
+            <w:shd w:fill="EDEDED"/>
+            <w:vAlign w:val="center"/>
+          </w:tcPr>
+          <w:p>
+            <w:pPr>
+              <w:spacing w:line="360" w:lineRule="exact"/>
+              <w:jc w:val="center"/>
+            </w:pPr>
+            <w:r/>
+            <w:r>
+              <w:rPr>
+                <w:rFonts w:ascii="Times New Roman" w:hAnsi="Times New Roman" w:eastAsia="宋体"/>
+                <w:b/>
+                <w:i w:val="0"/>
+                <w:sz w:val="21"/>
+              </w:rPr>
+              <w:t>最终系统</w:t>
+            </w:r>
+          </w:p>
+        </w:tc>
+      </w:tr>
+      <w:tr>
+        <w:tc>
+          <w:tcPr>
+            <w:tcW w:type="dxa" w:w="2160"/>
+            <w:vAlign w:val="center"/>
+          </w:tcPr>
+          <w:p>
+            <w:pPr>
+              <w:spacing w:line="360" w:lineRule="exact"/>
+              <w:jc w:val="left"/>
+            </w:pPr>
+            <w:r/>
+            <w:r>
+              <w:rPr>
+                <w:rFonts w:ascii="Times New Roman" w:hAnsi="Times New Roman" w:eastAsia="宋体"/>
+                <w:b w:val="0"/>
+                <w:i w:val="0"/>
+                <w:sz w:val="21"/>
+              </w:rPr>
+              <w:t>输入来源</w:t>
+            </w:r>
+          </w:p>
+        </w:tc>
+        <w:tc>
+          <w:tcPr>
+            <w:tcW w:type="dxa" w:w="3600"/>
+            <w:vAlign w:val="center"/>
+          </w:tcPr>
+          <w:p>
+            <w:pPr>
+              <w:spacing w:line="360" w:lineRule="exact"/>
+              <w:jc w:val="left"/>
+            </w:pPr>
+            <w:r/>
+            <w:r>
+              <w:rPr>
+                <w:rFonts w:ascii="Times New Roman" w:hAnsi="Times New Roman" w:eastAsia="宋体"/>
+                <w:b w:val="0"/>
+                <w:i w:val="0"/>
+                <w:sz w:val="21"/>
+              </w:rPr>
+              <w:t>单模型 diarization timeline</w:t>
+            </w:r>
+          </w:p>
+        </w:tc>
+        <w:tc>
+          <w:tcPr>
+            <w:tcW w:type="dxa" w:w="3888"/>
+            <w:vAlign w:val="center"/>
+          </w:tcPr>
+          <w:p>
+            <w:pPr>
+              <w:spacing w:line="360" w:lineRule="exact"/>
+              <w:jc w:val="left"/>
+            </w:pPr>
+            <w:r/>
+            <w:r>
+              <w:rPr>
+                <w:rFonts w:ascii="Times New Roman" w:hAnsi="Times New Roman" w:eastAsia="宋体"/>
+                <w:b w:val="0"/>
+                <w:i w:val="0"/>
+                <w:sz w:val="21"/>
+              </w:rPr>
+              <w:t>Sortformer + DiariZen cached outputs</w:t>
+            </w:r>
+          </w:p>
+        </w:tc>
+      </w:tr>
+      <w:tr>
+        <w:tc>
+          <w:tcPr>
+            <w:tcW w:type="dxa" w:w="2160"/>
+            <w:vAlign w:val="center"/>
+          </w:tcPr>
+          <w:p>
+            <w:pPr>
+              <w:spacing w:line="360" w:lineRule="exact"/>
+              <w:jc w:val="left"/>
+            </w:pPr>
+            <w:r/>
+            <w:r>
+              <w:rPr>
+                <w:rFonts w:ascii="Times New Roman" w:hAnsi="Times New Roman" w:eastAsia="宋体"/>
+                <w:b w:val="0"/>
+                <w:i w:val="0"/>
+                <w:sz w:val="21"/>
+              </w:rPr>
+              <w:t>决策方式</w:t>
+            </w:r>
+          </w:p>
+        </w:tc>
+        <w:tc>
+          <w:tcPr>
+            <w:tcW w:type="dxa" w:w="3600"/>
+            <w:vAlign w:val="center"/>
+          </w:tcPr>
+          <w:p>
+            <w:pPr>
+              <w:spacing w:line="360" w:lineRule="exact"/>
+              <w:jc w:val="left"/>
+            </w:pPr>
+            <w:r/>
+            <w:r>
+              <w:rPr>
+                <w:rFonts w:ascii="Times New Roman" w:hAnsi="Times New Roman" w:eastAsia="宋体"/>
+                <w:b w:val="0"/>
+                <w:i w:val="0"/>
+                <w:sz w:val="21"/>
+              </w:rPr>
+              <w:t>直接使用模型输出</w:t>
+            </w:r>
+          </w:p>
+        </w:tc>
+        <w:tc>
+          <w:tcPr>
+            <w:tcW w:type="dxa" w:w="3888"/>
+            <w:vAlign w:val="center"/>
+          </w:tcPr>
+          <w:p>
+            <w:pPr>
+              <w:spacing w:line="360" w:lineRule="exact"/>
+              <w:jc w:val="left"/>
+            </w:pPr>
+            <w:r/>
+            <w:r>
+              <w:rPr>
+                <w:rFonts w:ascii="Times New Roman" w:hAnsi="Times New Roman" w:eastAsia="宋体"/>
+                <w:b w:val="0"/>
+                <w:i w:val="0"/>
+                <w:sz w:val="21"/>
+              </w:rPr>
+              <w:t>slow-first selector + fallback + rule recover</w:t>
+            </w:r>
+          </w:p>
+        </w:tc>
+      </w:tr>
+      <w:tr>
+        <w:tc>
+          <w:tcPr>
+            <w:tcW w:type="dxa" w:w="2160"/>
+            <w:vAlign w:val="center"/>
+          </w:tcPr>
+          <w:p>
+            <w:pPr>
+              <w:spacing w:line="360" w:lineRule="exact"/>
+              <w:jc w:val="left"/>
+            </w:pPr>
+            <w:r/>
+            <w:r>
+              <w:rPr>
+                <w:rFonts w:ascii="Times New Roman" w:hAnsi="Times New Roman" w:eastAsia="宋体"/>
+                <w:b w:val="0"/>
+                <w:i w:val="0"/>
+                <w:sz w:val="21"/>
+              </w:rPr>
+              <w:t>LLM 参与</w:t>
+            </w:r>
+          </w:p>
+        </w:tc>
+        <w:tc>
+          <w:tcPr>
+            <w:tcW w:type="dxa" w:w="3600"/>
+            <w:vAlign w:val="center"/>
+          </w:tcPr>
+          <w:p>
+            <w:pPr>
+              <w:spacing w:line="360" w:lineRule="exact"/>
+              <w:jc w:val="left"/>
+            </w:pPr>
+            <w:r/>
+            <w:r>
+              <w:rPr>
+                <w:rFonts w:ascii="Times New Roman" w:hAnsi="Times New Roman" w:eastAsia="宋体"/>
+                <w:b w:val="0"/>
+                <w:i w:val="0"/>
+                <w:sz w:val="21"/>
+              </w:rPr>
+              <w:t>通常不参与</w:t>
+            </w:r>
+          </w:p>
+        </w:tc>
+        <w:tc>
+          <w:tcPr>
+            <w:tcW w:type="dxa" w:w="3888"/>
+            <w:vAlign w:val="center"/>
+          </w:tcPr>
+          <w:p>
+            <w:pPr>
+              <w:spacing w:line="360" w:lineRule="exact"/>
+              <w:jc w:val="left"/>
+            </w:pPr>
+            <w:r/>
+            <w:r>
+              <w:rPr>
+                <w:rFonts w:ascii="Times New Roman" w:hAnsi="Times New Roman" w:eastAsia="宋体"/>
+                <w:b w:val="0"/>
+                <w:i w:val="0"/>
+                <w:sz w:val="21"/>
+              </w:rPr>
+              <w:t>离线准备证据，运行时不调用 API</w:t>
+            </w:r>
+          </w:p>
+        </w:tc>
+      </w:tr>
+      <w:tr>
+        <w:tc>
+          <w:tcPr>
+            <w:tcW w:type="dxa" w:w="2160"/>
+            <w:vAlign w:val="center"/>
+          </w:tcPr>
+          <w:p>
+            <w:pPr>
+              <w:spacing w:line="360" w:lineRule="exact"/>
+              <w:jc w:val="left"/>
+            </w:pPr>
+            <w:r/>
+            <w:r>
+              <w:rPr>
+                <w:rFonts w:ascii="Times New Roman" w:hAnsi="Times New Roman" w:eastAsia="宋体"/>
+                <w:b w:val="0"/>
+                <w:i w:val="0"/>
+                <w:sz w:val="21"/>
+              </w:rPr>
+              <w:t>风险控制</w:t>
+            </w:r>
+          </w:p>
+        </w:tc>
+        <w:tc>
+          <w:tcPr>
+            <w:tcW w:type="dxa" w:w="3600"/>
+            <w:vAlign w:val="center"/>
+          </w:tcPr>
+          <w:p>
+            <w:pPr>
+              <w:spacing w:line="360" w:lineRule="exact"/>
+              <w:jc w:val="left"/>
+            </w:pPr>
+            <w:r/>
+            <w:r>
+              <w:rPr>
+                <w:rFonts w:ascii="Times New Roman" w:hAnsi="Times New Roman" w:eastAsia="宋体"/>
+                <w:b w:val="0"/>
+                <w:i w:val="0"/>
+                <w:sz w:val="21"/>
+              </w:rPr>
+              <w:t>缺少显式 guard</w:t>
+            </w:r>
+          </w:p>
+        </w:tc>
+        <w:tc>
+          <w:tcPr>
+            <w:tcW w:type="dxa" w:w="3888"/>
+            <w:vAlign w:val="center"/>
+          </w:tcPr>
+          <w:p>
+            <w:pPr>
+              <w:spacing w:line="360" w:lineRule="exact"/>
+              <w:jc w:val="left"/>
+            </w:pPr>
+            <w:r/>
+            <w:r>
+              <w:rPr>
+                <w:rFonts w:ascii="Times New Roman" w:hAnsi="Times New Roman" w:eastAsia="宋体"/>
+                <w:b w:val="0"/>
+                <w:i w:val="0"/>
+                <w:sz w:val="21"/>
+              </w:rPr>
+              <w:t>guard/quarantine gate 阻断有害修改</w:t>
+            </w:r>
+          </w:p>
+        </w:tc>
+      </w:tr>
+      <w:tr>
+        <w:tc>
+          <w:tcPr>
+            <w:tcW w:type="dxa" w:w="2160"/>
+            <w:vAlign w:val="center"/>
+          </w:tcPr>
+          <w:p>
+            <w:pPr>
+              <w:spacing w:line="360" w:lineRule="exact"/>
+              <w:jc w:val="left"/>
+            </w:pPr>
+            <w:r/>
+            <w:r>
+              <w:rPr>
+                <w:rFonts w:ascii="Times New Roman" w:hAnsi="Times New Roman" w:eastAsia="宋体"/>
+                <w:b w:val="0"/>
+                <w:i w:val="0"/>
+                <w:sz w:val="21"/>
+              </w:rPr>
+              <w:t>复现方式</w:t>
+            </w:r>
+          </w:p>
+        </w:tc>
+        <w:tc>
+          <w:tcPr>
+            <w:tcW w:type="dxa" w:w="3600"/>
+            <w:vAlign w:val="center"/>
+          </w:tcPr>
+          <w:p>
+            <w:pPr>
+              <w:spacing w:line="360" w:lineRule="exact"/>
+              <w:jc w:val="left"/>
+            </w:pPr>
+            <w:r/>
+            <w:r>
+              <w:rPr>
+                <w:rFonts w:ascii="Times New Roman" w:hAnsi="Times New Roman" w:eastAsia="宋体"/>
+                <w:b w:val="0"/>
+                <w:i w:val="0"/>
+                <w:sz w:val="21"/>
+              </w:rPr>
+              <w:t>依赖重新推理或缓存</w:t>
+            </w:r>
+          </w:p>
+        </w:tc>
+        <w:tc>
+          <w:tcPr>
+            <w:tcW w:type="dxa" w:w="3888"/>
+            <w:vAlign w:val="center"/>
+          </w:tcPr>
+          <w:p>
+            <w:pPr>
+              <w:spacing w:line="360" w:lineRule="exact"/>
+              <w:jc w:val="left"/>
+            </w:pPr>
+            <w:r/>
+            <w:r>
+              <w:rPr>
+                <w:rFonts w:ascii="Times New Roman" w:hAnsi="Times New Roman" w:eastAsia="宋体"/>
+                <w:b w:val="0"/>
+                <w:i w:val="0"/>
+                <w:sz w:val="21"/>
+              </w:rPr>
+              <w:t>cached outputs + frozen artifacts</w:t>
+            </w:r>
+          </w:p>
+        </w:tc>
+      </w:tr>
+      <w:tr>
+        <w:tc>
+          <w:tcPr>
+            <w:tcW w:type="dxa" w:w="2160"/>
+            <w:vAlign w:val="center"/>
+          </w:tcPr>
+          <w:p>
+            <w:pPr>
+              <w:spacing w:line="360" w:lineRule="exact"/>
+              <w:jc w:val="left"/>
+            </w:pPr>
+            <w:r/>
+            <w:r>
+              <w:rPr>
+                <w:rFonts w:ascii="Times New Roman" w:hAnsi="Times New Roman" w:eastAsia="宋体"/>
+                <w:b w:val="0"/>
+                <w:i w:val="0"/>
+                <w:sz w:val="21"/>
+              </w:rPr>
+              <w:t>验证方式</w:t>
+            </w:r>
+          </w:p>
+        </w:tc>
+        <w:tc>
+          <w:tcPr>
+            <w:tcW w:type="dxa" w:w="3600"/>
+            <w:vAlign w:val="center"/>
+          </w:tcPr>
+          <w:p>
+            <w:pPr>
+              <w:spacing w:line="360" w:lineRule="exact"/>
+              <w:jc w:val="left"/>
+            </w:pPr>
+            <w:r/>
+            <w:r>
+              <w:rPr>
+                <w:rFonts w:ascii="Times New Roman" w:hAnsi="Times New Roman" w:eastAsia="宋体"/>
+                <w:b w:val="0"/>
+                <w:i w:val="0"/>
+                <w:sz w:val="21"/>
+              </w:rPr>
+              <w:t>以 DER 为主</w:t>
+            </w:r>
+          </w:p>
+        </w:tc>
+        <w:tc>
+          <w:tcPr>
+            <w:tcW w:type="dxa" w:w="3888"/>
+            <w:vAlign w:val="center"/>
+          </w:tcPr>
+          <w:p>
+            <w:pPr>
+              <w:spacing w:line="360" w:lineRule="exact"/>
+              <w:jc w:val="left"/>
+            </w:pPr>
+            <w:r/>
+            <w:r>
+              <w:rPr>
+                <w:rFonts w:ascii="Times New Roman" w:hAnsi="Times New Roman" w:eastAsia="宋体"/>
+                <w:b w:val="0"/>
+                <w:i w:val="0"/>
+                <w:sz w:val="21"/>
+              </w:rPr>
+              <w:t>DER + baseline audit + integrity + self-check</w:t>
+            </w:r>
+          </w:p>
+        </w:tc>
+      </w:tr>
+    </w:tbl>
+    <w:p>
+      <w:pPr>
+        <w:spacing w:line="360" w:lineRule="exact" w:before="0" w:after="0"/>
+        <w:ind w:firstLine="0"/>
+        <w:jc w:val="both"/>
+      </w:pPr>
+    </w:p>
+    <w:p>
+      <w:pPr>
+        <w:spacing w:line="360" w:lineRule="exact" w:before="0" w:after="0"/>
+        <w:ind w:firstLine="420"/>
+        <w:jc w:val="both"/>
+      </w:pPr>
+      <w:r>
+        <w:rPr>
+          <w:rFonts w:ascii="Times New Roman" w:hAnsi="Times New Roman" w:eastAsia="宋体"/>
+          <w:b w:val="0"/>
+          <w:i w:val="0"/>
+          <w:sz w:val="21"/>
+        </w:rPr>
+        <w:t>实时性方面，本文报告 first-output latency proxy 和 rule-writeback latency proxy 两类参数。前者用于刻画系统产生首个输出的延迟代理指标，平均值为 0.383 秒，p95 为 0.444 秒；后者用于刻画规则回写路径的延迟代理指标，平均值为 24.65 秒，p95 为 28.33 秒。离线 replay RTF 为 0.000855，说明在 cached-window replay 条件下，默认复现过程计算开销很低。</w:t>
+      </w:r>
+    </w:p>
+    <w:p>
+      <w:pPr>
+        <w:spacing w:line="360" w:lineRule="exact" w:before="0" w:after="0"/>
+        <w:ind w:firstLine="420"/>
+        <w:jc w:val="both"/>
+      </w:pPr>
+      <w:r>
+        <w:rPr>
+          <w:rFonts w:ascii="Times New Roman" w:hAnsi="Times New Roman" w:eastAsia="宋体"/>
+          <w:b w:val="0"/>
+          <w:i w:val="0"/>
+          <w:sz w:val="21"/>
+        </w:rPr>
+        <w:t>需要强调的是，上述实时性参数是离线 replay 条件下的代理指标，而不是端到端在线流式系统的真实部署延迟。本文使用这些指标的目的，是让交付版本在没有重新推理和在线 API 调用的情况下，仍然能够报告稳定的运行开销参考。若后续要部署到在线会议系统，还需要进一步评估模型推理延迟、音频缓冲策略和并发处理能力。</w:t>
+      </w:r>
     </w:p>
     <w:p>
       <w:pPr>
@@ -3075,6 +4384,23 @@
     </w:p>
     <w:p>
       <w:pPr>
+        <w:pStyle w:val="3"/>
+        <w:spacing w:line="360" w:lineRule="exact" w:before="180" w:after="180"/>
+        <w:ind w:firstLine="420"/>
+        <w:jc w:val="left"/>
+      </w:pPr>
+      <w:r>
+        <w:rPr>
+          <w:rFonts w:ascii="Times New Roman" w:hAnsi="Times New Roman" w:eastAsia="黑体"/>
+          <w:b/>
+          <w:i w:val="0"/>
+          <w:sz w:val="21"/>
+        </w:rPr>
+        <w:t>6.1 性能提升分析</w:t>
+      </w:r>
+    </w:p>
+    <w:p>
+      <w:pPr>
         <w:spacing w:line="360" w:lineRule="exact" w:before="0" w:after="0"/>
         <w:ind w:firstLine="420"/>
         <w:jc w:val="both"/>
@@ -3118,7 +4444,170 @@
           <w:i w:val="0"/>
           <w:sz w:val="21"/>
         </w:rPr>
+        <w:t>从错误组成看，最终系统仍然存在 Miss、False Alarm 和 Confusion 三类错误。这说明当前系统并没有完全解决会议语音的复杂性，而是在现有强基线基础上对部分可恢复错误进行了有限修正。换言之，本课题的主要价值不是声称彻底解决说话人分离问题，而是证明在可审计、可复现的工程约束下，可以通过离线增强进一步压低 DER。</w:t>
+      </w:r>
+    </w:p>
+    <w:p>
+      <w:pPr>
+        <w:pStyle w:val="3"/>
+        <w:spacing w:line="360" w:lineRule="exact" w:before="180" w:after="180"/>
+        <w:ind w:firstLine="420"/>
+        <w:jc w:val="left"/>
+      </w:pPr>
+      <w:r>
+        <w:rPr>
+          <w:rFonts w:ascii="Times New Roman" w:hAnsi="Times New Roman" w:eastAsia="黑体"/>
+          <w:b/>
+          <w:i w:val="0"/>
+          <w:sz w:val="21"/>
+        </w:rPr>
+        <w:t>6.2 离线增强策略的优势</w:t>
+      </w:r>
+    </w:p>
+    <w:p>
+      <w:pPr>
+        <w:spacing w:line="360" w:lineRule="exact" w:before="0" w:after="0"/>
+        <w:ind w:firstLine="420"/>
+        <w:jc w:val="both"/>
+      </w:pPr>
+      <w:r>
+        <w:rPr>
+          <w:rFonts w:ascii="Times New Roman" w:hAnsi="Times New Roman" w:eastAsia="宋体"/>
+          <w:b w:val="0"/>
+          <w:i w:val="0"/>
+          <w:sz w:val="21"/>
+        </w:rPr>
+        <w:t>与直接在线调用 LLM 或外部模型相比，离线增强策略更适合课程项目交付。首先，离线策略不依赖外部网络和 API key，复现门槛更低。其次，所有候选修改和证据都以 artifact 形式固定下来，评审者可以追踪最终结果来自哪些输入。最后，guard/quarantine gate 能够显式控制修改进入最终 timeline 的条件，降低局部规则造成整体退化的风险。</w:t>
+      </w:r>
+    </w:p>
+    <w:p>
+      <w:pPr>
+        <w:spacing w:line="360" w:lineRule="exact" w:before="0" w:after="0"/>
+        <w:ind w:firstLine="420"/>
+        <w:jc w:val="both"/>
+      </w:pPr>
+      <w:r>
+        <w:rPr>
+          <w:rFonts w:ascii="Times New Roman" w:hAnsi="Times New Roman" w:eastAsia="宋体"/>
+          <w:b w:val="0"/>
+          <w:i w:val="0"/>
+          <w:sz w:val="21"/>
+        </w:rPr>
+        <w:t>这种设计也体现了工程上的保守性。对于强基线任务，激进地修改大量窗口可能在 development-pool 上得到短期提升，但很容易在新数据上退化。本文系统采用 slow-first、sparse overlay 和 safe fallback 的组合，实际上是一种“少改、慎改、可回退”的策略，更符合可交付系统的要求。</w:t>
+      </w:r>
+    </w:p>
+    <w:p>
+      <w:pPr>
+        <w:pStyle w:val="3"/>
+        <w:spacing w:line="360" w:lineRule="exact" w:before="180" w:after="180"/>
+        <w:ind w:firstLine="420"/>
+        <w:jc w:val="left"/>
+      </w:pPr>
+      <w:r>
+        <w:rPr>
+          <w:rFonts w:ascii="Times New Roman" w:hAnsi="Times New Roman" w:eastAsia="黑体"/>
+          <w:b/>
+          <w:i w:val="0"/>
+          <w:sz w:val="21"/>
+        </w:rPr>
+        <w:t>6.3 可复现性与交付价值</w:t>
+      </w:r>
+    </w:p>
+    <w:p>
+      <w:pPr>
+        <w:spacing w:line="360" w:lineRule="exact" w:before="0" w:after="0"/>
+        <w:ind w:firstLine="420"/>
+        <w:jc w:val="both"/>
+      </w:pPr>
+      <w:r>
+        <w:rPr>
+          <w:rFonts w:ascii="Times New Roman" w:hAnsi="Times New Roman" w:eastAsia="宋体"/>
+          <w:b w:val="0"/>
+          <w:i w:val="0"/>
+          <w:sz w:val="21"/>
+        </w:rPr>
+        <w:t>本项目最终交付的不只是一个结果数字，还包括 README、TECHNICAL_REPORT、PAPER、模板 Word 报告、PPT、DOWNLOAD_MANIFEST、SUBMISSION_MANIFEST、Python package 和 outputs 目录。用户可以通过 alimeeting-quick-start 获取最短复现结果，也可以通过 alimeeting-regression 执行完整验收。</w:t>
+      </w:r>
+    </w:p>
+    <w:p>
+      <w:pPr>
+        <w:spacing w:line="360" w:lineRule="exact" w:before="0" w:after="0"/>
+        <w:ind w:firstLine="420"/>
+        <w:jc w:val="both"/>
+      </w:pPr>
+      <w:r>
+        <w:rPr>
+          <w:rFonts w:ascii="Times New Roman" w:hAnsi="Times New Roman" w:eastAsia="宋体"/>
+          <w:b w:val="0"/>
+          <w:i w:val="0"/>
+          <w:sz w:val="21"/>
+        </w:rPr>
+        <w:t>完整 regression 的 29/29 通过说明，最终系统的命令入口、缓存路径、评估逻辑和指标文件之间保持一致。self-check 状态为 warn 而非 fail，其中 4 个 warn 主要来自 promotion boundary，而不是代码执行失败。这种自检结果有助于评审者区分“系统能否运行”和“结果是否已经完成泛化验证”这两个不同问题。</w:t>
+      </w:r>
+    </w:p>
+    <w:p>
+      <w:pPr>
+        <w:pStyle w:val="3"/>
+        <w:spacing w:line="360" w:lineRule="exact" w:before="180" w:after="180"/>
+        <w:ind w:firstLine="420"/>
+        <w:jc w:val="left"/>
+      </w:pPr>
+      <w:r>
+        <w:rPr>
+          <w:rFonts w:ascii="Times New Roman" w:hAnsi="Times New Roman" w:eastAsia="黑体"/>
+          <w:b/>
+          <w:i w:val="0"/>
+          <w:sz w:val="21"/>
+        </w:rPr>
+        <w:t>6.4 局限性与后续工作</w:t>
+      </w:r>
+    </w:p>
+    <w:p>
+      <w:pPr>
+        <w:spacing w:line="360" w:lineRule="exact" w:before="0" w:after="0"/>
+        <w:ind w:firstLine="420"/>
+        <w:jc w:val="both"/>
+      </w:pPr>
+      <w:r>
+        <w:rPr>
+          <w:rFonts w:ascii="Times New Roman" w:hAnsi="Times New Roman" w:eastAsia="宋体"/>
+          <w:b w:val="0"/>
+          <w:i w:val="0"/>
+          <w:sz w:val="21"/>
+        </w:rPr>
         <w:t>需要说明的是，当前 self-check 状态为 warn，而不是 fail。warn 主要来自 promotion boundary：当前仍缺少 sealed true-heldout split 上的最终验证，selector robustness 与 recording-level stability 也需要在更大范围数据上继续确认。因此，本课题结论应表述为：在 AliMeeting Eval development-pool 的 8 条录音、120 个 30 秒窗口上，最终离线增强系统优于当前跟踪的同窗口 baseline，而不是泛化意义上的绝对最优。</w:t>
+      </w:r>
+    </w:p>
+    <w:p>
+      <w:pPr>
+        <w:spacing w:line="360" w:lineRule="exact" w:before="0" w:after="0"/>
+        <w:ind w:firstLine="420"/>
+        <w:jc w:val="both"/>
+      </w:pPr>
+      <w:r>
+        <w:rPr>
+          <w:rFonts w:ascii="Times New Roman" w:hAnsi="Times New Roman" w:eastAsia="宋体"/>
+          <w:b w:val="0"/>
+          <w:i w:val="0"/>
+          <w:sz w:val="21"/>
+        </w:rPr>
+        <w:t>后续工作可以从三个方向展开。第一，构建 sealed true-heldout split，在完全不参与调参的数据上验证最终系统。第二，引入更强的 deployable candidate surface，例如更强的说话人嵌入、更细粒度音频特征或新的 diarization 模型输出。第三，进一步完善 recording-level stability 分析，避免系统只在窗口级平均指标上提升，而在某些录音上出现局部退化。</w:t>
+      </w:r>
+    </w:p>
+    <w:p>
+      <w:pPr>
+        <w:spacing w:line="360" w:lineRule="exact" w:before="0" w:after="0"/>
+        <w:ind w:firstLine="420"/>
+        <w:jc w:val="both"/>
+      </w:pPr>
+      <w:r>
+        <w:rPr>
+          <w:rFonts w:ascii="Times New Roman" w:hAnsi="Times New Roman" w:eastAsia="宋体"/>
+          <w:b w:val="0"/>
+          <w:i w:val="0"/>
+          <w:sz w:val="21"/>
+        </w:rPr>
+        <w:t>此外，如果未来需要把系统从离线 replay 扩展到真实在线会议场景，还需要重新设计音频缓冲、增量输出、在线说话人身份维护和端到端延迟评估。当前系统已经保留 realtime 命令和实时性代理参数，但默认交付仍以可复现离线系统为主。</w:t>
       </w:r>
     </w:p>
     <w:p>
@@ -3361,6 +4850,38 @@
           <w:sz w:val="21"/>
         </w:rPr>
         <w:t>C. 最终交付物包括 README.md、PAPER.md、TECHNICAL_REPORT.md、SUBMISSION_MANIFEST.md、DOWNLOAD_MANIFEST.md、pyproject.toml、requirements.txt、alimeeting_diarization_bench/、outputs/ 以及最终展示 PPT 和 PDF/Word 报告。</w:t>
+      </w:r>
+    </w:p>
+    <w:p>
+      <w:pPr>
+        <w:spacing w:line="360" w:lineRule="exact" w:before="0" w:after="0"/>
+        <w:ind w:firstLine="420"/>
+        <w:jc w:val="both"/>
+      </w:pPr>
+      <w:r>
+        <w:rPr>
+          <w:rFonts w:ascii="Times New Roman" w:hAnsi="Times New Roman" w:eastAsia="宋体"/>
+          <w:b w:val="0"/>
+          <w:i w:val="0"/>
+          <w:sz w:val="21"/>
+        </w:rPr>
+        <w:t>D. 默认模型与数据集说明：数据集为 AliMeeting Eval set，核心模型输出来自 Sortformer fast baseline 与 DiariZen slow baseline。默认交付系统不进行在线 LLM 推理，只读取本地 frozen artifacts。</w:t>
+      </w:r>
+    </w:p>
+    <w:p>
+      <w:pPr>
+        <w:spacing w:line="360" w:lineRule="exact" w:before="0" w:after="0"/>
+        <w:ind w:firstLine="420"/>
+        <w:jc w:val="both"/>
+      </w:pPr>
+      <w:r>
+        <w:rPr>
+          <w:rFonts w:ascii="Times New Roman" w:hAnsi="Times New Roman" w:eastAsia="宋体"/>
+          <w:b w:val="0"/>
+          <w:i w:val="0"/>
+          <w:sz w:val="21"/>
+        </w:rPr>
+        <w:t>E. 结果边界说明：当前结果是 development-pool result。最终 DER 16.4923% 优于当前跟踪的同窗口 baseline，但不应被表述为所有未知会议数据上的泛化最优。</w:t>
       </w:r>
     </w:p>
     <w:sectPr>

</xml_diff>

<commit_message>
Expand main report body
</commit_message>
<xml_diff>
--- a/output/docx/2026AI微专业综合设计报告_说话人分离系统.docx
+++ b/output/docx/2026AI微专业综合设计报告_说话人分离系统.docx
@@ -1728,6 +1728,38 @@
     </w:p>
     <w:p>
       <w:pPr>
+        <w:spacing w:line="360" w:lineRule="exact" w:before="0" w:after="0"/>
+        <w:ind w:firstLine="420"/>
+        <w:jc w:val="both"/>
+      </w:pPr>
+      <w:r>
+        <w:rPr>
+          <w:rFonts w:ascii="Times New Roman" w:hAnsi="Times New Roman" w:eastAsia="宋体"/>
+          <w:b w:val="0"/>
+          <w:i w:val="0"/>
+          <w:sz w:val="21"/>
+        </w:rPr>
+        <w:t>从应用场景看，说话人分离可以服务于多类智能会议产品。例如，在自动会议纪要系统中，系统不仅要知道会议讨论了什么，还要知道不同观点分别由谁提出；在课堂录播和访谈整理中，系统需要区分教师、学生、主持人和嘉宾；在企业协同系统中，发言人身份还会影响任务分配、决策追踪和责任确认。因此，稳定的说话人分离结果是会议语音从“声音文件”转化为“结构化知识”的重要基础。</w:t>
+      </w:r>
+    </w:p>
+    <w:p>
+      <w:pPr>
+        <w:spacing w:line="360" w:lineRule="exact" w:before="0" w:after="0"/>
+        <w:ind w:firstLine="420"/>
+        <w:jc w:val="both"/>
+      </w:pPr>
+      <w:r>
+        <w:rPr>
+          <w:rFonts w:ascii="Times New Roman" w:hAnsi="Times New Roman" w:eastAsia="宋体"/>
+          <w:b w:val="0"/>
+          <w:i w:val="0"/>
+          <w:sz w:val="21"/>
+        </w:rPr>
+        <w:t>从课程综合设计角度看，本课题也体现了人工智能系统工程的完整流程。项目从公开数据集和已有模型出发，经过 baseline 建立、误差分析、增强策略设计、离线证据固化、代码模块化、指标评估和文档交付，最终形成可运行版本。这一流程比单纯调参更接近真实工程实践：模型能力只是系统的一部分，复现方式、风险边界、结果审计和使用说明同样决定项目是否能够被可靠交付。</w:t>
+      </w:r>
+    </w:p>
+    <w:p>
+      <w:pPr>
         <w:pStyle w:val="2"/>
         <w:spacing w:line="360" w:lineRule="exact" w:before="180" w:after="180"/>
         <w:ind w:firstLine="0"/>
@@ -1810,6 +1842,38 @@
     </w:p>
     <w:p>
       <w:pPr>
+        <w:spacing w:line="360" w:lineRule="exact" w:before="0" w:after="0"/>
+        <w:ind w:firstLine="420"/>
+        <w:jc w:val="both"/>
+      </w:pPr>
+      <w:r>
+        <w:rPr>
+          <w:rFonts w:ascii="Times New Roman" w:hAnsi="Times New Roman" w:eastAsia="宋体"/>
+          <w:b w:val="0"/>
+          <w:i w:val="0"/>
+          <w:sz w:val="21"/>
+        </w:rPr>
+        <w:t>说话人分离系统通常还面临“局部正确”和“全局稳定”之间的矛盾。一个模型可能在某些窗口上表现很好，但在另一些录音中出现明显退化；某条规则可能修复少量边界错误，却在更多场景中增加误检。因此，最终系统不能只追求单个窗口的局部收益，而需要考虑整体 DER、录音级稳定性和修改可解释性。</w:t>
+      </w:r>
+    </w:p>
+    <w:p>
+      <w:pPr>
+        <w:spacing w:line="360" w:lineRule="exact" w:before="0" w:after="0"/>
+        <w:ind w:firstLine="420"/>
+        <w:jc w:val="both"/>
+      </w:pPr>
+      <w:r>
+        <w:rPr>
+          <w:rFonts w:ascii="Times New Roman" w:hAnsi="Times New Roman" w:eastAsia="宋体"/>
+          <w:b w:val="0"/>
+          <w:i w:val="0"/>
+          <w:sz w:val="21"/>
+        </w:rPr>
+        <w:t>此外，会议语音的真实标注成本较高。与图像分类等任务相比，说话人分离标注需要精确到时间边界和说话人身份，人工校对复杂且耗时。在这种条件下，充分利用已有强基线输出、缓存结果和离线证据，往往比从零训练一个新模型更符合课程项目的资源约束。</w:t>
+      </w:r>
+    </w:p>
+    <w:p>
+      <w:pPr>
         <w:pStyle w:val="3"/>
         <w:spacing w:line="360" w:lineRule="exact" w:before="180" w:after="180"/>
         <w:ind w:firstLine="420"/>
@@ -1875,6 +1939,38 @@
     </w:p>
     <w:p>
       <w:pPr>
+        <w:spacing w:line="360" w:lineRule="exact" w:before="0" w:after="0"/>
+        <w:ind w:firstLine="420"/>
+        <w:jc w:val="both"/>
+      </w:pPr>
+      <w:r>
+        <w:rPr>
+          <w:rFonts w:ascii="Times New Roman" w:hAnsi="Times New Roman" w:eastAsia="宋体"/>
+          <w:b w:val="0"/>
+          <w:i w:val="0"/>
+          <w:sz w:val="21"/>
+        </w:rPr>
+        <w:t>本课题采用 30 秒窗口作为评估组织方式，主要是为了兼顾会议上下文和局部分析粒度。窗口过短时，系统难以获得足够的说话人上下文；窗口过长时，错误定位和候选修正会变得不够精细。120 个窗口能够形成较稳定的 development-pool 评估池，也便于对不同 baseline 和增强策略进行同窗口对比。</w:t>
+      </w:r>
+    </w:p>
+    <w:p>
+      <w:pPr>
+        <w:spacing w:line="360" w:lineRule="exact" w:before="0" w:after="0"/>
+        <w:ind w:firstLine="420"/>
+        <w:jc w:val="both"/>
+      </w:pPr>
+      <w:r>
+        <w:rPr>
+          <w:rFonts w:ascii="Times New Roman" w:hAnsi="Times New Roman" w:eastAsia="宋体"/>
+          <w:b w:val="0"/>
+          <w:i w:val="0"/>
+          <w:sz w:val="21"/>
+        </w:rPr>
+        <w:t>在最终交付中，数据集原始路径和 cached outputs 被明确记录在 README、DOWNLOAD_MANIFEST 和附录中。这样做的原因是，语音项目很容易出现“代码能运行但数据路径不一致”的问题。通过把数据来源、缓存文件和评估入口写清楚，可以降低复现实验时的环境歧义。</w:t>
+      </w:r>
+    </w:p>
+    <w:p>
+      <w:pPr>
         <w:pStyle w:val="3"/>
         <w:spacing w:line="360" w:lineRule="exact" w:before="180" w:after="180"/>
         <w:ind w:firstLine="420"/>
@@ -1920,6 +2016,38 @@
           <w:sz w:val="21"/>
         </w:rPr>
         <w:t>除这两个核心基线外，项目代码包中还保留了 PyAnnote、PyAnnote Community、Fun-ASR、Paraformer v2、ASR Flash、Omni Plus 和 GPT-4o audio adapter 等模型适配器，便于后续扩展实验。但最终默认交付系统不依赖这些在线或额外模型路径，不调用 live API，而是通过 frozen artifacts 复现当前结果。</w:t>
+      </w:r>
+    </w:p>
+    <w:p>
+      <w:pPr>
+        <w:spacing w:line="360" w:lineRule="exact" w:before="0" w:after="0"/>
+        <w:ind w:firstLine="420"/>
+        <w:jc w:val="both"/>
+      </w:pPr>
+      <w:r>
+        <w:rPr>
+          <w:rFonts w:ascii="Times New Roman" w:hAnsi="Times New Roman" w:eastAsia="宋体"/>
+          <w:b w:val="0"/>
+          <w:i w:val="0"/>
+          <w:sz w:val="21"/>
+        </w:rPr>
+        <w:t>在实际项目中，模型适配器的保留具有两层意义。第一，它为后续实验提供可扩展接口，如果需要引入新的候选输出，不必重写整个评估框架。第二，它把“研究探索”和“最终交付”分开：探索阶段可以尝试多种模型，交付阶段则只保留稳定、可复现且已经通过审计的默认路径。</w:t>
+      </w:r>
+    </w:p>
+    <w:p>
+      <w:pPr>
+        <w:spacing w:line="360" w:lineRule="exact" w:before="0" w:after="0"/>
+        <w:ind w:firstLine="420"/>
+        <w:jc w:val="both"/>
+      </w:pPr>
+      <w:r>
+        <w:rPr>
+          <w:rFonts w:ascii="Times New Roman" w:hAnsi="Times New Roman" w:eastAsia="宋体"/>
+          <w:b w:val="0"/>
+          <w:i w:val="0"/>
+          <w:sz w:val="21"/>
+        </w:rPr>
+        <w:t>因此，最终报告中的模型说明并不只是列出模型名称，而是强调它们在系统中的角色差异。Sortformer 更偏向快速候选，DiariZen 更偏向高质量主路径，离线增强层负责在二者之上进行受控修正。这种角色划分使系统结构更加清晰，也便于解释最终结果为什么能够优于单一 baseline。</w:t>
       </w:r>
     </w:p>
     <w:p>
@@ -2006,6 +2134,38 @@
     </w:p>
     <w:p>
       <w:pPr>
+        <w:spacing w:line="360" w:lineRule="exact" w:before="0" w:after="0"/>
+        <w:ind w:firstLine="420"/>
+        <w:jc w:val="both"/>
+      </w:pPr>
+      <w:r>
+        <w:rPr>
+          <w:rFonts w:ascii="Times New Roman" w:hAnsi="Times New Roman" w:eastAsia="宋体"/>
+          <w:b w:val="0"/>
+          <w:i w:val="0"/>
+          <w:sz w:val="21"/>
+        </w:rPr>
+        <w:t>从优化角度看，DER 的三个分项之间也可能存在相互牵制。降低 Miss 的策略通常会使系统更倾向于检测语音，但如果过于激进，可能增加 False Alarm；减少 Confusion 需要更准确地区分说话人身份，但过度切分又可能带来边界碎片化。因此，最终系统选择保守增强策略，避免为了优化某一分项而明显损害其他分项。</w:t>
+      </w:r>
+    </w:p>
+    <w:p>
+      <w:pPr>
+        <w:spacing w:line="360" w:lineRule="exact" w:before="0" w:after="0"/>
+        <w:ind w:firstLine="420"/>
+        <w:jc w:val="both"/>
+      </w:pPr>
+      <w:r>
+        <w:rPr>
+          <w:rFonts w:ascii="Times New Roman" w:hAnsi="Times New Roman" w:eastAsia="宋体"/>
+          <w:b w:val="0"/>
+          <w:i w:val="0"/>
+          <w:sz w:val="21"/>
+        </w:rPr>
+        <w:t>本课题在报告最终 DER 的同时保留 Miss、FA、Confusion，是为了让评审者看到系统错误结构，而不是只看到一个总分。对于后续改进而言，如果 Miss 占主导，应重点加强弱能量语音和重叠语音检测；如果 Confusion 占主导，则需要改进说话人表示和聚类；如果 False Alarm 占主导，则需要更严格的语音活动过滤。</w:t>
+      </w:r>
+    </w:p>
+    <w:p>
+      <w:pPr>
         <w:pStyle w:val="3"/>
         <w:spacing w:line="360" w:lineRule="exact" w:before="180" w:after="180"/>
         <w:ind w:firstLine="420"/>
@@ -2055,6 +2215,38 @@
     </w:p>
     <w:p>
       <w:pPr>
+        <w:spacing w:line="360" w:lineRule="exact" w:before="0" w:after="0"/>
+        <w:ind w:firstLine="420"/>
+        <w:jc w:val="both"/>
+      </w:pPr>
+      <w:r>
+        <w:rPr>
+          <w:rFonts w:ascii="Times New Roman" w:hAnsi="Times New Roman" w:eastAsia="宋体"/>
+          <w:b w:val="0"/>
+          <w:i w:val="0"/>
+          <w:sz w:val="21"/>
+        </w:rPr>
+        <w:t>slow-first 的设计来自当前评估结果中的经验事实：DiariZen slow baseline 的整体 DER 明显低于 Sortformer fast baseline，因此在没有额外风险证据时，优先采用慢速强基线是更稳健的选择。但这并不意味着 slow baseline 的每个局部输出都不可修改。最终系统只在具备离线证据和 guard 允许的情况下做少量修正，从而避免把融合策略变成不受约束的窗口级挑选。</w:t>
+      </w:r>
+    </w:p>
+    <w:p>
+      <w:pPr>
+        <w:spacing w:line="360" w:lineRule="exact" w:before="0" w:after="0"/>
+        <w:ind w:firstLine="420"/>
+        <w:jc w:val="both"/>
+      </w:pPr>
+      <w:r>
+        <w:rPr>
+          <w:rFonts w:ascii="Times New Roman" w:hAnsi="Times New Roman" w:eastAsia="宋体"/>
+          <w:b w:val="0"/>
+          <w:i w:val="0"/>
+          <w:sz w:val="21"/>
+        </w:rPr>
+        <w:t>fast fallback 的意义也不仅是“使用更快模型”。在部分窗口中，快速模型可能保留了更简单、更保守的边界结构，反而可以作为风险较低的候选。最终系统将 fast baseline 作为安全回退参考，使增强层在遇到不确定情况时有明确的退路，而不是强行采用可能造成退化的修改。</w:t>
+      </w:r>
+    </w:p>
+    <w:p>
+      <w:pPr>
         <w:pStyle w:val="3"/>
         <w:spacing w:line="360" w:lineRule="exact" w:before="180" w:after="180"/>
         <w:ind w:firstLine="420"/>
@@ -2104,6 +2296,38 @@
     </w:p>
     <w:p>
       <w:pPr>
+        <w:spacing w:line="360" w:lineRule="exact" w:before="0" w:after="0"/>
+        <w:ind w:firstLine="420"/>
+        <w:jc w:val="both"/>
+      </w:pPr>
+      <w:r>
+        <w:rPr>
+          <w:rFonts w:ascii="Times New Roman" w:hAnsi="Times New Roman" w:eastAsia="宋体"/>
+          <w:b w:val="0"/>
+          <w:i w:val="0"/>
+          <w:sz w:val="21"/>
+        </w:rPr>
+        <w:t>从系统设计角度看，离线 LLM/agent 证据更适合作为“辅助决策材料”，而不是最终判决器。它可以帮助整理候选规则、提示异常窗口、归纳 patch evidence，但最终是否写回 timeline 仍由确定性的 runtime 和 guard gate 控制。这样既利用了 LLM/agent 在模式整理和候选生成上的能力，又避免了运行时不可控输出直接影响评估结果。</w:t>
+      </w:r>
+    </w:p>
+    <w:p>
+      <w:pPr>
+        <w:spacing w:line="360" w:lineRule="exact" w:before="0" w:after="0"/>
+        <w:ind w:firstLine="420"/>
+        <w:jc w:val="both"/>
+      </w:pPr>
+      <w:r>
+        <w:rPr>
+          <w:rFonts w:ascii="Times New Roman" w:hAnsi="Times New Roman" w:eastAsia="宋体"/>
+          <w:b w:val="0"/>
+          <w:i w:val="0"/>
+          <w:sz w:val="21"/>
+        </w:rPr>
+        <w:t>因此，本文所说的 LLM 注入不是在线调用大模型改写结果，而是将前期 agent 搜索得到的候选证据固化到本地文件中。最终系统运行时只读取这些 frozen artifacts，并通过固定逻辑处理。该设计使系统更接近可审计工程流程，而不是一次性、不可复现的在线推理实验。</w:t>
+      </w:r>
+    </w:p>
+    <w:p>
+      <w:pPr>
         <w:pStyle w:val="3"/>
         <w:spacing w:line="360" w:lineRule="exact" w:before="180" w:after="180"/>
         <w:ind w:firstLine="420"/>
@@ -2149,6 +2373,103 @@
           <w:sz w:val="21"/>
         </w:rPr>
         <w:t>同时，系统保留 safe fast fallback。当 slow-first 输出或局部增强存在风险时，fallback 机制允许系统回退到更安全的候选输出。这样最终系统不是一味追求激进提升，而是在可控边界内做少量高置信修正。</w:t>
+      </w:r>
+    </w:p>
+    <w:p>
+      <w:pPr>
+        <w:spacing w:line="360" w:lineRule="exact" w:before="0" w:after="0"/>
+        <w:ind w:firstLine="420"/>
+        <w:jc w:val="both"/>
+      </w:pPr>
+      <w:r>
+        <w:rPr>
+          <w:rFonts w:ascii="Times New Roman" w:hAnsi="Times New Roman" w:eastAsia="宋体"/>
+          <w:b w:val="0"/>
+          <w:i w:val="0"/>
+          <w:sz w:val="21"/>
+        </w:rPr>
+        <w:t>guard 的作用还体现在 timeline 完整性上。说话人分离输出并不是普通分类标签，而是带有时间起止点的结构化序列；任何修改都可能造成时间重叠、片段断裂、说话人标签不一致或输出格式错误。因此，最终系统不仅检查指标收益，也检查 timeline 是否保持可解析、可评估和可导出。</w:t>
+      </w:r>
+    </w:p>
+    <w:p>
+      <w:pPr>
+        <w:spacing w:line="360" w:lineRule="exact" w:before="0" w:after="0"/>
+        <w:ind w:firstLine="420"/>
+        <w:jc w:val="both"/>
+      </w:pPr>
+      <w:r>
+        <w:rPr>
+          <w:rFonts w:ascii="Times New Roman" w:hAnsi="Times New Roman" w:eastAsia="宋体"/>
+          <w:b w:val="0"/>
+          <w:i w:val="0"/>
+          <w:sz w:val="21"/>
+        </w:rPr>
+        <w:t>这种机制使最终系统更像一个带有安全边界的后处理框架。它允许系统从候选结果中吸收局部收益，但不会让未经验证的修改随意进入最终提交。对于课程交付而言，这种稳健性比追求短期最大提升更重要。</w:t>
+      </w:r>
+    </w:p>
+    <w:p>
+      <w:pPr>
+        <w:pStyle w:val="3"/>
+        <w:spacing w:line="360" w:lineRule="exact" w:before="180" w:after="180"/>
+        <w:ind w:firstLine="420"/>
+        <w:jc w:val="left"/>
+      </w:pPr>
+      <w:r>
+        <w:rPr>
+          <w:rFonts w:ascii="Times New Roman" w:hAnsi="Times New Roman" w:eastAsia="黑体"/>
+          <w:b/>
+          <w:i w:val="0"/>
+          <w:sz w:val="21"/>
+        </w:rPr>
+        <w:t>3.5 可复现评测与工程约束</w:t>
+      </w:r>
+    </w:p>
+    <w:p>
+      <w:pPr>
+        <w:spacing w:line="360" w:lineRule="exact" w:before="0" w:after="0"/>
+        <w:ind w:firstLine="420"/>
+        <w:jc w:val="both"/>
+      </w:pPr>
+      <w:r>
+        <w:rPr>
+          <w:rFonts w:ascii="Times New Roman" w:hAnsi="Times New Roman" w:eastAsia="宋体"/>
+          <w:b w:val="0"/>
+          <w:i w:val="0"/>
+          <w:sz w:val="21"/>
+        </w:rPr>
+        <w:t>本课题将可复现性视为系统设计的一部分，而不是实验结束后的附加说明。可复现性主要体现在三个层面：输入可复现，即数据集划分、窗口数量和 cached outputs 被固定；流程可复现，即 quick start、batch、regression 和 self-check 都有稳定命令入口；结果可复现，即最终 DER、baseline margin、live API calls 和 regression 状态都记录在 outputs 中。</w:t>
+      </w:r>
+    </w:p>
+    <w:p>
+      <w:pPr>
+        <w:spacing w:line="360" w:lineRule="exact" w:before="0" w:after="0"/>
+        <w:ind w:firstLine="420"/>
+        <w:jc w:val="both"/>
+      </w:pPr>
+      <w:r>
+        <w:rPr>
+          <w:rFonts w:ascii="Times New Roman" w:hAnsi="Times New Roman" w:eastAsia="宋体"/>
+          <w:b w:val="0"/>
+          <w:i w:val="0"/>
+          <w:sz w:val="21"/>
+        </w:rPr>
+        <w:t>工程约束也影响了方法选择。若重新训练或在线推理成本过高，课程评审环境可能无法复现实验；若大量依赖临时脚本，后续维护和检查会变得困难。因此，最终版本将散脚本整理为 package 模块，把可执行入口注册到 pyproject.toml，并将与交付无关的开发期文件排除。</w:t>
+      </w:r>
+    </w:p>
+    <w:p>
+      <w:pPr>
+        <w:spacing w:line="360" w:lineRule="exact" w:before="0" w:after="0"/>
+        <w:ind w:firstLine="420"/>
+        <w:jc w:val="both"/>
+      </w:pPr>
+      <w:r>
+        <w:rPr>
+          <w:rFonts w:ascii="Times New Roman" w:hAnsi="Times New Roman" w:eastAsia="宋体"/>
+          <w:b w:val="0"/>
+          <w:i w:val="0"/>
+          <w:sz w:val="21"/>
+        </w:rPr>
+        <w:t>这种工程化整理能够让报告中的方法与仓库中的实现互相对应。正文介绍 slow-first selector、fallback、rule recover 和 guard gate；代码中则有 final/ 目录下的 quick_start、realtime_system、regression、self_check 和 audit 模块。评审者既可以阅读报告，也可以运行命令验证结果。</w:t>
       </w:r>
     </w:p>
     <w:p>
@@ -2219,6 +2540,38 @@
     </w:p>
     <w:p>
       <w:pPr>
+        <w:spacing w:line="360" w:lineRule="exact" w:before="0" w:after="0"/>
+        <w:ind w:firstLine="420"/>
+        <w:jc w:val="both"/>
+      </w:pPr>
+      <w:r>
+        <w:rPr>
+          <w:rFonts w:ascii="Times New Roman" w:hAnsi="Times New Roman" w:eastAsia="宋体"/>
+          <w:b w:val="0"/>
+          <w:i w:val="0"/>
+          <w:sz w:val="21"/>
+        </w:rPr>
+        <w:t>基线整理阶段的一个关键原则是同窗口对比。只有在相同录音、相同窗口划分和相同评估脚本下比较，DER 差异才具有直接解释意义。否则，不同实验可能因为数据池、窗口数量或评分配置不同而无法比较。本课题最终保留 120 个同窗口评估样本，正是为了保证 baseline leaderboard 和最终系统结果具有一致基准。</w:t>
+      </w:r>
+    </w:p>
+    <w:p>
+      <w:pPr>
+        <w:spacing w:line="360" w:lineRule="exact" w:before="0" w:after="0"/>
+        <w:ind w:firstLine="420"/>
+        <w:jc w:val="both"/>
+      </w:pPr>
+      <w:r>
+        <w:rPr>
+          <w:rFonts w:ascii="Times New Roman" w:hAnsi="Times New Roman" w:eastAsia="宋体"/>
+          <w:b w:val="0"/>
+          <w:i w:val="0"/>
+          <w:sz w:val="21"/>
+        </w:rPr>
+        <w:t>此外，项目还保留了 clipped baseline audit、baseline leaderboard audit 和 headroom audit 等诊断输出。这些文件用于回答两个问题：第一，当前 final system 是否确实优于所有跟踪 baseline；第二，在现有 candidate surface 下还有多少可挖掘空间。通过这些审计结果，系统提升不再只是一个孤立数字，而是放在完整 baseline 体系中解释。</w:t>
+      </w:r>
+    </w:p>
+    <w:p>
+      <w:pPr>
         <w:pStyle w:val="3"/>
         <w:spacing w:line="360" w:lineRule="exact" w:before="180" w:after="180"/>
         <w:ind w:firstLine="420"/>
@@ -2264,6 +2617,38 @@
           <w:sz w:val="21"/>
         </w:rPr>
         <w:t>系统输出包括 RTTM、CSV、JSON metrics、baseline comparison、timeline integrity report 和 self-check report。相比单纯输出一个 DER 数值，这种设计能够让每一步修改都有迹可循，也便于后续定位系统收益来自哪里、风险边界在哪里。</w:t>
+      </w:r>
+    </w:p>
+    <w:p>
+      <w:pPr>
+        <w:spacing w:line="360" w:lineRule="exact" w:before="0" w:after="0"/>
+        <w:ind w:firstLine="420"/>
+        <w:jc w:val="both"/>
+      </w:pPr>
+      <w:r>
+        <w:rPr>
+          <w:rFonts w:ascii="Times New Roman" w:hAnsi="Times New Roman" w:eastAsia="宋体"/>
+          <w:b w:val="0"/>
+          <w:i w:val="0"/>
+          <w:sz w:val="21"/>
+        </w:rPr>
+        <w:t>RTTM 输出用于与常见 diarization 评测工具兼容，CSV 输出便于人工查看片段级结果，JSON metrics 则适合 regression 和自动化检查。baseline comparison 负责说明最终结果与各个 baseline 的差异，timeline integrity report 用于检查时间轴结构是否合法，self-check report 则把系统状态汇总为 pass、warn 和 fail。</w:t>
+      </w:r>
+    </w:p>
+    <w:p>
+      <w:pPr>
+        <w:spacing w:line="360" w:lineRule="exact" w:before="0" w:after="0"/>
+        <w:ind w:firstLine="420"/>
+        <w:jc w:val="both"/>
+      </w:pPr>
+      <w:r>
+        <w:rPr>
+          <w:rFonts w:ascii="Times New Roman" w:hAnsi="Times New Roman" w:eastAsia="宋体"/>
+          <w:b w:val="0"/>
+          <w:i w:val="0"/>
+          <w:sz w:val="21"/>
+        </w:rPr>
+        <w:t>最终系统的运行路径可以分为“读取、选择、修正、过滤、输出”五个阶段。读取阶段加载基线和离线证据；选择阶段确定以 slow baseline 为主的候选；修正阶段应用少量 rule-recover overlay；过滤阶段通过 guard/quarantine gate 排除风险修改；输出阶段生成最终 timeline 和评估报告。该分层结构使系统逻辑更加清晰，也便于未来替换某一阶段而不影响整体接口。</w:t>
       </w:r>
     </w:p>
     <w:tbl>
@@ -2658,6 +3043,38 @@
     </w:p>
     <w:p>
       <w:pPr>
+        <w:spacing w:line="360" w:lineRule="exact" w:before="0" w:after="0"/>
+        <w:ind w:firstLine="420"/>
+        <w:jc w:val="both"/>
+      </w:pPr>
+      <w:r>
+        <w:rPr>
+          <w:rFonts w:ascii="Times New Roman" w:hAnsi="Times New Roman" w:eastAsia="宋体"/>
+          <w:b w:val="0"/>
+          <w:i w:val="0"/>
+          <w:sz w:val="21"/>
+        </w:rPr>
+        <w:t>在代码组织上，final/ 目录承担最终交付职责，models/ 目录负责模型适配，evaluation/ 目录负责评估流程，metrics/ 目录负责指标计算。这样的分层避免了评估逻辑和模型调用混杂在同一个脚本中，也使后续扩展更加直接。例如，若新增一个 diarization 模型，只需要增加对应 adapter 并接入统一评估流程。</w:t>
+      </w:r>
+    </w:p>
+    <w:p>
+      <w:pPr>
+        <w:spacing w:line="360" w:lineRule="exact" w:before="0" w:after="0"/>
+        <w:ind w:firstLine="420"/>
+        <w:jc w:val="both"/>
+      </w:pPr>
+      <w:r>
+        <w:rPr>
+          <w:rFonts w:ascii="Times New Roman" w:hAnsi="Times New Roman" w:eastAsia="宋体"/>
+          <w:b w:val="0"/>
+          <w:i w:val="0"/>
+          <w:sz w:val="21"/>
+        </w:rPr>
+        <w:t>命令行入口的设计也降低了使用门槛。对于第一次运行项目的用户，alimeeting-quick-start 是最短路径；对于完整验收，alimeeting-regression 是更严格路径；对于系统健康检查，alimeeting-self-check 能快速暴露缓存缺失、指标不一致或 promotion boundary 问题。</w:t>
+      </w:r>
+    </w:p>
+    <w:p>
+      <w:pPr>
         <w:pStyle w:val="3"/>
         <w:spacing w:line="360" w:lineRule="exact" w:before="180" w:after="180"/>
         <w:ind w:firstLine="420"/>
@@ -2703,6 +3120,38 @@
           <w:sz w:val="21"/>
         </w:rPr>
         <w:t>同时，项目没有把 development-pool 结果夸大为最终泛化结论。README、技术报告和本文均明确说明当前结果仍需 sealed true-heldout split 验证，selector robustness 与 recording-level stability 也是后续提升方向。这种边界说明有助于保持结果表述严谨。</w:t>
+      </w:r>
+    </w:p>
+    <w:p>
+      <w:pPr>
+        <w:spacing w:line="360" w:lineRule="exact" w:before="0" w:after="0"/>
+        <w:ind w:firstLine="420"/>
+        <w:jc w:val="both"/>
+      </w:pPr>
+      <w:r>
+        <w:rPr>
+          <w:rFonts w:ascii="Times New Roman" w:hAnsi="Times New Roman" w:eastAsia="宋体"/>
+          <w:b w:val="0"/>
+          <w:i w:val="0"/>
+          <w:sz w:val="21"/>
+        </w:rPr>
+        <w:t>安全边界还体现在 secret 与 API 管理上。默认交付路径不需要填写真实 API key，.env.example 只提供环境变量示例，不包含内部密钥。这样可以降低交付包泄露敏感信息的风险，也使评审者能够在无外部服务权限的环境中运行默认流程。</w:t>
+      </w:r>
+    </w:p>
+    <w:p>
+      <w:pPr>
+        <w:spacing w:line="360" w:lineRule="exact" w:before="0" w:after="0"/>
+        <w:ind w:firstLine="420"/>
+        <w:jc w:val="both"/>
+      </w:pPr>
+      <w:r>
+        <w:rPr>
+          <w:rFonts w:ascii="Times New Roman" w:hAnsi="Times New Roman" w:eastAsia="宋体"/>
+          <w:b w:val="0"/>
+          <w:i w:val="0"/>
+          <w:sz w:val="21"/>
+        </w:rPr>
+        <w:t>因此，最终系统的交付策略可以概括为：结果用 cached artifacts 固定，运行用 package commands 管理，风险用 guard 和 self-check 显式暴露，结论用 development-pool boundary 约束。这样的设计更符合课程综合设计对“能运行、能解释、能复现”的要求。</w:t>
       </w:r>
     </w:p>
     <w:p>
@@ -4367,6 +4816,38 @@
     </w:p>
     <w:p>
       <w:pPr>
+        <w:spacing w:line="360" w:lineRule="exact" w:before="0" w:after="0"/>
+        <w:ind w:firstLine="420"/>
+        <w:jc w:val="both"/>
+      </w:pPr>
+      <w:r>
+        <w:rPr>
+          <w:rFonts w:ascii="Times New Roman" w:hAnsi="Times New Roman" w:eastAsia="宋体"/>
+          <w:b w:val="0"/>
+          <w:i w:val="0"/>
+          <w:sz w:val="21"/>
+        </w:rPr>
+        <w:t>实验设计中还加入了 regression 和 self-check 两类验证。regression 更关注完整流程是否能够从入口命令运行到最终指标，当前结果为 pass，29/29 步通过；self-check 更关注系统健康和推广边界，当前结果为 warn，40 pass / 4 warn / 0 fail。二者结合能够避免只看最终 DER 而忽略系统可用性。</w:t>
+      </w:r>
+    </w:p>
+    <w:p>
+      <w:pPr>
+        <w:spacing w:line="360" w:lineRule="exact" w:before="0" w:after="0"/>
+        <w:ind w:firstLine="420"/>
+        <w:jc w:val="both"/>
+      </w:pPr>
+      <w:r>
+        <w:rPr>
+          <w:rFonts w:ascii="Times New Roman" w:hAnsi="Times New Roman" w:eastAsia="宋体"/>
+          <w:b w:val="0"/>
+          <w:i w:val="0"/>
+          <w:sz w:val="21"/>
+        </w:rPr>
+        <w:t>从结果解释角度看，最终系统的核心优势不是大幅超过 slow baseline，而是在不调用在线 API、不重新训练模型、不破坏复现路径的条件下，仍然优于当前所有跟踪 baseline。这个结论与项目目标一致：在资源受限和交付约束下，构建一个稳定、可审计、可复核的增强系统。</w:t>
+      </w:r>
+    </w:p>
+    <w:p>
+      <w:pPr>
         <w:pStyle w:val="2"/>
         <w:spacing w:line="360" w:lineRule="exact" w:before="180" w:after="180"/>
         <w:ind w:firstLine="0"/>
@@ -4449,6 +4930,38 @@
     </w:p>
     <w:p>
       <w:pPr>
+        <w:spacing w:line="360" w:lineRule="exact" w:before="0" w:after="0"/>
+        <w:ind w:firstLine="420"/>
+        <w:jc w:val="both"/>
+      </w:pPr>
+      <w:r>
+        <w:rPr>
+          <w:rFonts w:ascii="Times New Roman" w:hAnsi="Times New Roman" w:eastAsia="宋体"/>
+          <w:b w:val="0"/>
+          <w:i w:val="0"/>
+          <w:sz w:val="21"/>
+        </w:rPr>
+        <w:t>进一步分析可以发现，final system 的改进空间主要集中在边界不确定和短片段恢复上。强基线模型已经能够处理大多数长时稳定发言片段，因此剩余收益通常来自少量困难窗口。若不加 guard 直接扩大规则覆盖范围，很可能把原本正确的片段改坏。因此，最终系统选择 sparse rule-recover overlay，而不是大面积重写 timeline。</w:t>
+      </w:r>
+    </w:p>
+    <w:p>
+      <w:pPr>
+        <w:spacing w:line="360" w:lineRule="exact" w:before="0" w:after="0"/>
+        <w:ind w:firstLine="420"/>
+        <w:jc w:val="both"/>
+      </w:pPr>
+      <w:r>
+        <w:rPr>
+          <w:rFonts w:ascii="Times New Roman" w:hAnsi="Times New Roman" w:eastAsia="宋体"/>
+          <w:b w:val="0"/>
+          <w:i w:val="0"/>
+          <w:sz w:val="21"/>
+        </w:rPr>
+        <w:t>这种现象也解释了为什么最终提升不是数量级变化。对于高错误率 baseline，简单替换模型就可能带来显著提升；但对于 DER 已经接近 16% 的强基线，剩余错误更分散、更局部，也更难通过通用规则修复。因此，0.3886 个百分点的提升应放在强基线背景下理解。</w:t>
+      </w:r>
+    </w:p>
+    <w:p>
+      <w:pPr>
         <w:pStyle w:val="3"/>
         <w:spacing w:line="360" w:lineRule="exact" w:before="180" w:after="180"/>
         <w:ind w:firstLine="420"/>
@@ -4498,6 +5011,38 @@
     </w:p>
     <w:p>
       <w:pPr>
+        <w:spacing w:line="360" w:lineRule="exact" w:before="0" w:after="0"/>
+        <w:ind w:firstLine="420"/>
+        <w:jc w:val="both"/>
+      </w:pPr>
+      <w:r>
+        <w:rPr>
+          <w:rFonts w:ascii="Times New Roman" w:hAnsi="Times New Roman" w:eastAsia="宋体"/>
+          <w:b w:val="0"/>
+          <w:i w:val="0"/>
+          <w:sz w:val="21"/>
+        </w:rPr>
+        <w:t>离线增强策略还有一个优势：它把探索过程和交付过程分离。探索阶段可以通过 agent 搜索、规则试验和 candidate surface 分析寻找可能收益；交付阶段只保留已经冻结、可复现、可审计的证据和运行逻辑。这样既保留了研究探索的灵活性，又避免把不稳定探索过程暴露给最终用户。</w:t>
+      </w:r>
+    </w:p>
+    <w:p>
+      <w:pPr>
+        <w:spacing w:line="360" w:lineRule="exact" w:before="0" w:after="0"/>
+        <w:ind w:firstLine="420"/>
+        <w:jc w:val="both"/>
+      </w:pPr>
+      <w:r>
+        <w:rPr>
+          <w:rFonts w:ascii="Times New Roman" w:hAnsi="Times New Roman" w:eastAsia="宋体"/>
+          <w:b w:val="0"/>
+          <w:i w:val="0"/>
+          <w:sz w:val="21"/>
+        </w:rPr>
+        <w:t>对于课程项目而言，这种分离尤其重要。老师评审时更关心最终项目能否按说明启动、指标能否复现、文档能否解释方法，而不是开发期间尝试过多少临时脚本。最终仓库将有用物件模块化保留，并删除无关开发脚本，正是为了让交付版本更清楚。</w:t>
+      </w:r>
+    </w:p>
+    <w:p>
+      <w:pPr>
         <w:pStyle w:val="3"/>
         <w:spacing w:line="360" w:lineRule="exact" w:before="180" w:after="180"/>
         <w:ind w:firstLine="420"/>
@@ -4543,6 +5088,38 @@
           <w:sz w:val="21"/>
         </w:rPr>
         <w:t>完整 regression 的 29/29 通过说明，最终系统的命令入口、缓存路径、评估逻辑和指标文件之间保持一致。self-check 状态为 warn 而非 fail，其中 4 个 warn 主要来自 promotion boundary，而不是代码执行失败。这种自检结果有助于评审者区分“系统能否运行”和“结果是否已经完成泛化验证”这两个不同问题。</w:t>
+      </w:r>
+    </w:p>
+    <w:p>
+      <w:pPr>
+        <w:spacing w:line="360" w:lineRule="exact" w:before="0" w:after="0"/>
+        <w:ind w:firstLine="420"/>
+        <w:jc w:val="both"/>
+      </w:pPr>
+      <w:r>
+        <w:rPr>
+          <w:rFonts w:ascii="Times New Roman" w:hAnsi="Times New Roman" w:eastAsia="宋体"/>
+          <w:b w:val="0"/>
+          <w:i w:val="0"/>
+          <w:sz w:val="21"/>
+        </w:rPr>
+        <w:t>交付价值还体现在文档体系上。README 面向启动和复现，TECHNICAL_REPORT 面向技术说明，PAPER 和 Word 报告面向课程提交，SUBMISSION_MANIFEST 面向交付清单，DOWNLOAD_MANIFEST 面向外部资源检查，PPT 面向展示汇报。这些文档分别服务不同读者，使项目不依赖口头说明也能被理解。</w:t>
+      </w:r>
+    </w:p>
+    <w:p>
+      <w:pPr>
+        <w:spacing w:line="360" w:lineRule="exact" w:before="0" w:after="0"/>
+        <w:ind w:firstLine="420"/>
+        <w:jc w:val="both"/>
+      </w:pPr>
+      <w:r>
+        <w:rPr>
+          <w:rFonts w:ascii="Times New Roman" w:hAnsi="Times New Roman" w:eastAsia="宋体"/>
+          <w:b w:val="0"/>
+          <w:i w:val="0"/>
+          <w:sz w:val="21"/>
+        </w:rPr>
+        <w:t>同时，所有关键结果都在 outputs 中保留对应文件，而不是只写在报告里。这样做可以让评审者从报告中的结论追溯到机器生成的 JSON metrics 或 regression report，提高结果可信度。</w:t>
       </w:r>
     </w:p>
     <w:p>

</xml_diff>